<commit_message>
Domínio principal passa a ser jsestudos.vercel.app
estudojs.vercel.app redireciona (308) para o novo endereço, preservando o
caminho. Referências na documentação e na apostila atualizadas.

Co-Authored-By: Claude Opus 5.5 <noreply@anthropic.com>
Claude-Session: https://claude.ai/code/session_01MHvAnKjrvrorJxR4J2dKJM
</commit_message>
<xml_diff>
--- a/docs/DOCUMENTACAO.docx
+++ b/docs/DOCUMENTACAO.docx
@@ -30,7 +30,7 @@
           <w:rPr>
             <w:rStyle w:val="Hyperlink"/>
           </w:rPr>
-          <w:t xml:space="preserve">https://estudojs.vercel.app</w:t>
+          <w:t xml:space="preserve">https://jsestudos.vercel.app</w:t>
         </w:r>
       </w:hyperlink>
       <w:r>
@@ -126,7 +126,7 @@
           <w:rPr>
             <w:rStyle w:val="Hyperlink"/>
           </w:rPr>
-          <w:t xml:space="preserve">https://estudojs.vercel.app</w:t>
+          <w:t xml:space="preserve">https://jsestudos.vercel.app</w:t>
         </w:r>
       </w:hyperlink>
       <w:r>
@@ -2869,7 +2869,7 @@
           <w:rPr>
             <w:rStyle w:val="Hyperlink"/>
           </w:rPr>
-          <w:t xml:space="preserve">https://estudojs.vercel.app</w:t>
+          <w:t xml:space="preserve">https://jsestudos.vercel.app</w:t>
         </w:r>
       </w:hyperlink>
       <w:r>

</xml_diff>

<commit_message>
Admin, tarefas em números e vídeo de apoio
- Administrador (rafael.glaucio2@gmail.com, e-mail confirmado) vê todos os
  alunos e o detalhe de cada um, somente leitura; regras do Firestore
  atualizadas e resumo do progresso guardado no perfil do aluno.
- Painel mostra as tarefas feitas em números (X de 145) e por dia.
- Botão "Veja um vídeo" (aula em português no YouTube) quando o aluno erra
  3 vezes, abre 2 dicas ou vê a solução; também nos tópicos de "Onde focar".

Co-Authored-By: Claude Opus 5.5 <noreply@anthropic.com>
Claude-Session: https://claude.ai/code/session_01MHvAnKjrvrorJxR4J2dKJM
</commit_message>
<xml_diff>
--- a/docs/DOCUMENTACAO.docx
+++ b/docs/DOCUMENTACAO.docx
@@ -2,7 +2,7 @@
 <file path=word/document.xml><?xml version="1.0" encoding="utf-8"?>
 <w:document xmlns:w="http://schemas.openxmlformats.org/wordprocessingml/2006/main" xmlns:m="http://schemas.openxmlformats.org/officeDocument/2006/math" xmlns:r="http://schemas.openxmlformats.org/officeDocument/2006/relationships" xmlns:o="urn:schemas-microsoft-com:office:office" xmlns:v="urn:schemas-microsoft-com:vml" xmlns:w10="urn:schemas-microsoft-com:office:word" xmlns:a="http://schemas.openxmlformats.org/drawingml/2006/main" xmlns:pic="http://schemas.openxmlformats.org/drawingml/2006/picture" xmlns:wp="http://schemas.openxmlformats.org/drawingml/2006/wordprocessingDrawing">
   <w:body>
-    <w:bookmarkStart w:id="40" w:name="estudojs--documentação-do-aplicativo"/>
+    <w:bookmarkStart w:id="42" w:name="estudojs--documentação-do-aplicativo"/>
     <w:p>
       <w:pPr>
         <w:pStyle w:val="Heading1"/>
@@ -89,7 +89,7 @@
         </w:pict>
       </w:r>
     </w:p>
-    <w:bookmarkStart w:id="30" w:name="parte-1--manual-do-aluno"/>
+    <w:bookmarkStart w:id="31" w:name="parte-1--manual-do-aluno"/>
     <w:p>
       <w:pPr>
         <w:pStyle w:val="Heading2"/>
@@ -1270,13 +1270,13 @@
       </w:r>
     </w:p>
     <w:bookmarkEnd w:id="26"/>
-    <w:bookmarkStart w:id="27" w:name="Xa2199fed55e83910699e0586fcdf3d18c3b1524"/>
+    <w:bookmarkStart w:id="27" w:name="X988e99aa4434a350087c97c8c6c34ead8080ff8"/>
     <w:p>
       <w:pPr>
         <w:pStyle w:val="Heading3"/>
       </w:pPr>
       <w:r>
-        <w:t xml:space="preserve">1.6 Revisão espaçada</w:t>
+        <w:t xml:space="preserve">1.5.1 Travou? Veja um vídeo</w:t>
       </w:r>
     </w:p>
     <w:p>
@@ -1284,7 +1284,7 @@
         <w:pStyle w:val="FirstParagraph"/>
       </w:pPr>
       <w:r>
-        <w:t xml:space="preserve">Cada exercício resolvido volta na aba</w:t>
+        <w:t xml:space="preserve">Quando você erra o mesmo exercício 3 vezes, abre 2 dicas ou vê a solução, aparece o botão</w:t>
       </w:r>
       <w:r>
         <w:t xml:space="preserve"> </w:t>
@@ -1294,10 +1294,40 @@
           <w:bCs/>
           <w:b/>
         </w:rPr>
-        <w:t xml:space="preserve">Revisão</w:t>
-      </w:r>
-      <w:r>
-        <w:t xml:space="preserve">: em 3 dias se você foi bem, ou no dia seguinte se usou a solução. A cada revisão bem-sucedida</w:t>
+        <w:t xml:space="preserve">🎬 Veja um vídeo</w:t>
+      </w:r>
+      <w:r>
+        <w:t xml:space="preserve">: uma aula em português no YouTube sobre o assunto do exercício. Os tópicos em “Onde focar”, no Painel, também têm o botão. A lista de vídeos fica em</w:t>
+      </w:r>
+      <w:r>
+        <w:t xml:space="preserve"> </w:t>
+      </w:r>
+      <w:r>
+        <w:rPr>
+          <w:rStyle w:val="VerbatimChar"/>
+        </w:rPr>
+        <w:t xml:space="preserve">src/content/videos.js</w:t>
+      </w:r>
+      <w:r>
+        <w:t xml:space="preserve">.</w:t>
+      </w:r>
+    </w:p>
+    <w:bookmarkEnd w:id="27"/>
+    <w:bookmarkStart w:id="28" w:name="Xa2199fed55e83910699e0586fcdf3d18c3b1524"/>
+    <w:p>
+      <w:pPr>
+        <w:pStyle w:val="Heading3"/>
+      </w:pPr>
+      <w:r>
+        <w:t xml:space="preserve">1.6 Revisão espaçada</w:t>
+      </w:r>
+    </w:p>
+    <w:p>
+      <w:pPr>
+        <w:pStyle w:val="FirstParagraph"/>
+      </w:pPr>
+      <w:r>
+        <w:t xml:space="preserve">Cada exercício resolvido volta na aba</w:t>
       </w:r>
       <w:r>
         <w:t xml:space="preserve"> </w:t>
@@ -1307,14 +1337,27 @@
           <w:bCs/>
           <w:b/>
         </w:rPr>
+        <w:t xml:space="preserve">Revisão</w:t>
+      </w:r>
+      <w:r>
+        <w:t xml:space="preserve">: em 3 dias se você foi bem, ou no dia seguinte se usou a solução. A cada revisão bem-sucedida</w:t>
+      </w:r>
+      <w:r>
+        <w:t xml:space="preserve"> </w:t>
+      </w:r>
+      <w:r>
+        <w:rPr>
+          <w:bCs/>
+          <w:b/>
+        </w:rPr>
         <w:t xml:space="preserve">sem ajuda</w:t>
       </w:r>
       <w:r>
         <w:t xml:space="preserve">, o intervalo cresce (cerca de 2,5×). Na revisão o editor começa vazio: você precisa lembrar. É isso que fixa o conhecimento.</w:t>
       </w:r>
     </w:p>
-    <w:bookmarkEnd w:id="27"/>
-    <w:bookmarkStart w:id="28" w:name="X4993205f7ddd48ffa8f14ae56148930e45e47ef"/>
+    <w:bookmarkEnd w:id="28"/>
+    <w:bookmarkStart w:id="29" w:name="X4993205f7ddd48ffa8f14ae56148930e45e47ef"/>
     <w:p>
       <w:pPr>
         <w:pStyle w:val="Heading3"/>
@@ -1335,8 +1378,8 @@
         <w:t xml:space="preserve">Revisões pendentes (10 min) → 2. Aula testando os exemplos (40–50 min) → 3. Exercícios (1h30–2h) → 4. Quiz (10 min) → 5. Diário (5 min). Pausas a cada 25–50 min.</w:t>
       </w:r>
     </w:p>
-    <w:bookmarkEnd w:id="28"/>
-    <w:bookmarkStart w:id="29" w:name="X6dc8f0d5356e8c16fdafb532c4c24c34aaba0ec"/>
+    <w:bookmarkEnd w:id="29"/>
+    <w:bookmarkStart w:id="30" w:name="X6dc8f0d5356e8c16fdafb532c4c24c34aaba0ec"/>
     <w:p>
       <w:pPr>
         <w:pStyle w:val="Heading3"/>
@@ -1518,9 +1561,9 @@
         </w:pict>
       </w:r>
     </w:p>
-    <w:bookmarkEnd w:id="29"/>
     <w:bookmarkEnd w:id="30"/>
-    <w:bookmarkStart w:id="39" w:name="parte-2--documentação-técnica"/>
+    <w:bookmarkEnd w:id="31"/>
+    <w:bookmarkStart w:id="41" w:name="parte-2--documentação-técnica"/>
     <w:p>
       <w:pPr>
         <w:pStyle w:val="Heading2"/>
@@ -1529,7 +1572,7 @@
         <w:t xml:space="preserve">Parte 2 — Documentação técnica</w:t>
       </w:r>
     </w:p>
-    <w:bookmarkStart w:id="31" w:name="X2b521c1e9cc8a05ed18f782e716115ddc052798"/>
+    <w:bookmarkStart w:id="32" w:name="X2b521c1e9cc8a05ed18f782e716115ddc052798"/>
     <w:p>
       <w:pPr>
         <w:pStyle w:val="Heading3"/>
@@ -1828,8 +1871,8 @@
         </w:tc>
       </w:tr>
     </w:tbl>
-    <w:bookmarkEnd w:id="31"/>
-    <w:bookmarkStart w:id="32" w:name="X8196d7790687983162b23032d232afd9a98e67d"/>
+    <w:bookmarkEnd w:id="32"/>
+    <w:bookmarkStart w:id="33" w:name="X8196d7790687983162b23032d232afd9a98e67d"/>
     <w:p>
       <w:pPr>
         <w:pStyle w:val="Heading3"/>
@@ -2065,8 +2108,8 @@
         <w:t xml:space="preserve">docs/                apostila, documentação, revisão do projeto</w:t>
       </w:r>
     </w:p>
-    <w:bookmarkEnd w:id="32"/>
-    <w:bookmarkStart w:id="33" w:name="Xb583d11f78fbb8ef43b188a057facf38f0675dc"/>
+    <w:bookmarkEnd w:id="33"/>
+    <w:bookmarkStart w:id="34" w:name="Xb583d11f78fbb8ef43b188a057facf38f0675dc"/>
     <w:p>
       <w:pPr>
         <w:pStyle w:val="Heading3"/>
@@ -2347,8 +2390,8 @@
         <w:t xml:space="preserve">principal, 1,5 s por teste assíncrono, 300 linhas de console.</w:t>
       </w:r>
     </w:p>
-    <w:bookmarkEnd w:id="33"/>
-    <w:bookmarkStart w:id="34" w:name="Xfaba23abf3c054b6d9d3988fdd6609edf0728be"/>
+    <w:bookmarkEnd w:id="34"/>
+    <w:bookmarkStart w:id="35" w:name="Xfaba23abf3c054b6d9d3988fdd6609edf0728be"/>
     <w:p>
       <w:pPr>
         <w:pStyle w:val="Heading3"/>
@@ -2445,8 +2488,8 @@
         <w:t xml:space="preserve">(“modo local”).</w:t>
       </w:r>
     </w:p>
-    <w:bookmarkEnd w:id="34"/>
-    <w:bookmarkStart w:id="35" w:name="X849eea489b120574476a6d9af7adedbaa368ddd"/>
+    <w:bookmarkEnd w:id="35"/>
+    <w:bookmarkStart w:id="36" w:name="X849eea489b120574476a6d9af7adedbaa368ddd"/>
     <w:p>
       <w:pPr>
         <w:pStyle w:val="Heading3"/>
@@ -2728,8 +2771,186 @@
         <w:t xml:space="preserve">) e é cadastrada nas variáveis de ambiente da Vercel.</w:t>
       </w:r>
     </w:p>
-    <w:bookmarkEnd w:id="35"/>
-    <w:bookmarkStart w:id="36" w:name="Xc97d66532232175837c1025324c5d1336b4623f"/>
+    <w:bookmarkEnd w:id="36"/>
+    <w:bookmarkStart w:id="37" w:name="X89bed35c4118cbb1954f356229143ac61cec794"/>
+    <w:p>
+      <w:pPr>
+        <w:pStyle w:val="Heading3"/>
+      </w:pPr>
+      <w:r>
+        <w:t xml:space="preserve">2.5.1 Administrador</w:t>
+      </w:r>
+    </w:p>
+    <w:p>
+      <w:pPr>
+        <w:pStyle w:val="FirstParagraph"/>
+      </w:pPr>
+      <w:r>
+        <w:t xml:space="preserve">O e-mail listado em</w:t>
+      </w:r>
+      <w:r>
+        <w:t xml:space="preserve"> </w:t>
+      </w:r>
+      <w:r>
+        <w:rPr>
+          <w:rStyle w:val="VerbatimChar"/>
+        </w:rPr>
+        <w:t xml:space="preserve">ADMIN_EMAILS</w:t>
+      </w:r>
+      <w:r>
+        <w:t xml:space="preserve"> </w:t>
+      </w:r>
+      <w:r>
+        <w:t xml:space="preserve">(</w:t>
+      </w:r>
+      <w:r>
+        <w:rPr>
+          <w:rStyle w:val="VerbatimChar"/>
+        </w:rPr>
+        <w:t xml:space="preserve">src/config.js</w:t>
+      </w:r>
+      <w:r>
+        <w:t xml:space="preserve">) e na função</w:t>
+      </w:r>
+      <w:r>
+        <w:t xml:space="preserve"> </w:t>
+      </w:r>
+      <w:r>
+        <w:rPr>
+          <w:rStyle w:val="VerbatimChar"/>
+        </w:rPr>
+        <w:t xml:space="preserve">isAdmin()</w:t>
+      </w:r>
+      <w:r>
+        <w:t xml:space="preserve"> </w:t>
+      </w:r>
+      <w:r>
+        <w:t xml:space="preserve">do</w:t>
+      </w:r>
+      <w:r>
+        <w:t xml:space="preserve"> </w:t>
+      </w:r>
+      <w:r>
+        <w:rPr>
+          <w:rStyle w:val="VerbatimChar"/>
+        </w:rPr>
+        <w:t xml:space="preserve">firestore.rules</w:t>
+      </w:r>
+      <w:r>
+        <w:t xml:space="preserve"> </w:t>
+      </w:r>
+      <w:r>
+        <w:t xml:space="preserve">vê o menu</w:t>
+      </w:r>
+      <w:r>
+        <w:t xml:space="preserve"> </w:t>
+      </w:r>
+      <w:r>
+        <w:rPr>
+          <w:bCs/>
+          <w:b/>
+        </w:rPr>
+        <w:t xml:space="preserve">🛡️ Admin</w:t>
+      </w:r>
+      <w:r>
+        <w:t xml:space="preserve">:</w:t>
+      </w:r>
+    </w:p>
+    <w:p>
+      <w:pPr>
+        <w:numPr>
+          <w:ilvl w:val="0"/>
+          <w:numId w:val="1008"/>
+        </w:numPr>
+        <w:pStyle w:val="Compact"/>
+      </w:pPr>
+      <w:r>
+        <w:rPr>
+          <w:bCs/>
+          <w:b/>
+        </w:rPr>
+        <w:t xml:space="preserve">Lista de alunos</w:t>
+      </w:r>
+      <w:r>
+        <w:t xml:space="preserve">: tarefas feitas / total, etapa, tempo de estudo, última atividade e dificuldades (lidas do campo</w:t>
+      </w:r>
+      <w:r>
+        <w:t xml:space="preserve"> </w:t>
+      </w:r>
+      <w:r>
+        <w:rPr>
+          <w:rStyle w:val="VerbatimChar"/>
+        </w:rPr>
+        <w:t xml:space="preserve">resumo</w:t>
+      </w:r>
+      <w:r>
+        <w:t xml:space="preserve"> </w:t>
+      </w:r>
+      <w:r>
+        <w:t xml:space="preserve">do perfil, atualizado pelo app do aluno).</w:t>
+      </w:r>
+    </w:p>
+    <w:p>
+      <w:pPr>
+        <w:numPr>
+          <w:ilvl w:val="0"/>
+          <w:numId w:val="1008"/>
+        </w:numPr>
+        <w:pStyle w:val="Compact"/>
+      </w:pPr>
+      <w:r>
+        <w:rPr>
+          <w:bCs/>
+          <w:b/>
+        </w:rPr>
+        <w:t xml:space="preserve">Detalhe do aluno</w:t>
+      </w:r>
+      <w:r>
+        <w:t xml:space="preserve">: cada exercício (tentativas, dicas, solução vista, tempo, último código), notas dos quizzes, diário, erros mais comuns e tópicos com dificuldade.</w:t>
+      </w:r>
+    </w:p>
+    <w:p>
+      <w:pPr>
+        <w:pStyle w:val="FirstParagraph"/>
+      </w:pPr>
+      <w:r>
+        <w:t xml:space="preserve">O acesso é</w:t>
+      </w:r>
+      <w:r>
+        <w:t xml:space="preserve"> </w:t>
+      </w:r>
+      <w:r>
+        <w:rPr>
+          <w:bCs/>
+          <w:b/>
+        </w:rPr>
+        <w:t xml:space="preserve">somente leitura</w:t>
+      </w:r>
+      <w:r>
+        <w:t xml:space="preserve"> </w:t>
+      </w:r>
+      <w:r>
+        <w:t xml:space="preserve">e exige</w:t>
+      </w:r>
+      <w:r>
+        <w:t xml:space="preserve"> </w:t>
+      </w:r>
+      <w:r>
+        <w:rPr>
+          <w:bCs/>
+          <w:b/>
+        </w:rPr>
+        <w:t xml:space="preserve">e-mail confirmado</w:t>
+      </w:r>
+      <w:r>
+        <w:t xml:space="preserve"> </w:t>
+      </w:r>
+      <w:r>
+        <w:t xml:space="preserve">(a tela oferece reenviar a confirmação). Para trocar ou adicionar administradores, altere as duas listas e publique as regras.</w:t>
+      </w:r>
+    </w:p>
+    <w:bookmarkEnd w:id="37"/>
+    <w:bookmarkStart w:id="38" w:name="Xc97d66532232175837c1025324c5d1336b4623f"/>
     <w:p>
       <w:pPr>
         <w:pStyle w:val="Heading3"/>
@@ -3076,8 +3297,8 @@
         </w:tc>
       </w:tr>
     </w:tbl>
-    <w:bookmarkEnd w:id="36"/>
-    <w:bookmarkStart w:id="37" w:name="Xdd4c8a1345fd2a09b605956d9c108963a2a94c7"/>
+    <w:bookmarkEnd w:id="38"/>
+    <w:bookmarkStart w:id="39" w:name="Xdd4c8a1345fd2a09b605956d9c108963a2a94c7"/>
     <w:p>
       <w:pPr>
         <w:pStyle w:val="Heading3"/>
@@ -3749,8 +3970,8 @@
         <w:t xml:space="preserve"> }]</w:t>
       </w:r>
     </w:p>
-    <w:bookmarkEnd w:id="37"/>
-    <w:bookmarkStart w:id="38" w:name="X046d779b98efa05c2ef9f7e66a32c7d1ef738d4"/>
+    <w:bookmarkEnd w:id="39"/>
+    <w:bookmarkStart w:id="40" w:name="X046d779b98efa05c2ef9f7e66a32c7d1ef738d4"/>
     <w:p>
       <w:pPr>
         <w:pStyle w:val="Heading3"/>
@@ -3763,7 +3984,7 @@
       <w:pPr>
         <w:numPr>
           <w:ilvl w:val="0"/>
-          <w:numId w:val="1008"/>
+          <w:numId w:val="1009"/>
         </w:numPr>
         <w:pStyle w:val="Compact"/>
       </w:pPr>
@@ -3775,7 +3996,7 @@
       <w:pPr>
         <w:numPr>
           <w:ilvl w:val="0"/>
-          <w:numId w:val="1008"/>
+          <w:numId w:val="1009"/>
         </w:numPr>
         <w:pStyle w:val="Compact"/>
       </w:pPr>
@@ -3787,7 +4008,7 @@
       <w:pPr>
         <w:numPr>
           <w:ilvl w:val="0"/>
-          <w:numId w:val="1008"/>
+          <w:numId w:val="1009"/>
         </w:numPr>
         <w:pStyle w:val="Compact"/>
       </w:pPr>
@@ -3795,9 +4016,9 @@
         <w:t xml:space="preserve">Plano gratuito do Firestore: 50 mil leituras e 20 mil gravações por dia (suficiente para dezenas de alunos ativos).</w:t>
       </w:r>
     </w:p>
-    <w:bookmarkEnd w:id="38"/>
-    <w:bookmarkEnd w:id="39"/>
     <w:bookmarkEnd w:id="40"/>
+    <w:bookmarkEnd w:id="41"/>
+    <w:bookmarkEnd w:id="42"/>
     <w:sectPr/>
   </w:body>
 </w:document>
@@ -4198,6 +4419,9 @@
     <w:abstractNumId w:val="991"/>
   </w:num>
   <w:num w:numId="1008">
+    <w:abstractNumId w:val="991"/>
+  </w:num>
+  <w:num w:numId="1009">
     <w:abstractNumId w:val="991"/>
   </w:num>
 </w:numbering>

</xml_diff>

<commit_message>
Editor: sugestões em português enquanto digita
- Autocompletar com variáveis do código, objetos globais e palavras-chave.
- Depois de um ponto, métodos de array, texto, Math, JSON, document etc.
  com explicação curta.
- Modelos de código prontos (for, for...of, if/else, function, arrow, class,
  try/catch, async/fetch, eventos), também pelo botão 💡 e Ctrl+Espaço.
- Opção em Minha conta para desligar as sugestões automáticas.

Co-Authored-By: Claude Opus 5.5 <noreply@anthropic.com>
Claude-Session: https://claude.ai/code/session_01MHvAnKjrvrorJxR4J2dKJM
</commit_message>
<xml_diff>
--- a/docs/DOCUMENTACAO.docx
+++ b/docs/DOCUMENTACAO.docx
@@ -2,7 +2,7 @@
 <file path=word/document.xml><?xml version="1.0" encoding="utf-8"?>
 <w:document xmlns:w="http://schemas.openxmlformats.org/wordprocessingml/2006/main" xmlns:m="http://schemas.openxmlformats.org/officeDocument/2006/math" xmlns:r="http://schemas.openxmlformats.org/officeDocument/2006/relationships" xmlns:o="urn:schemas-microsoft-com:office:office" xmlns:v="urn:schemas-microsoft-com:vml" xmlns:w10="urn:schemas-microsoft-com:office:word" xmlns:a="http://schemas.openxmlformats.org/drawingml/2006/main" xmlns:pic="http://schemas.openxmlformats.org/drawingml/2006/picture" xmlns:wp="http://schemas.openxmlformats.org/drawingml/2006/wordprocessingDrawing">
   <w:body>
-    <w:bookmarkStart w:id="42" w:name="estudojs--documentação-do-aplicativo"/>
+    <w:bookmarkStart w:id="43" w:name="estudojs--documentação-do-aplicativo"/>
     <w:p>
       <w:pPr>
         <w:pStyle w:val="Heading1"/>
@@ -89,7 +89,7 @@
         </w:pict>
       </w:r>
     </w:p>
-    <w:bookmarkStart w:id="31" w:name="parte-1--manual-do-aluno"/>
+    <w:bookmarkStart w:id="32" w:name="parte-1--manual-do-aluno"/>
     <w:p>
       <w:pPr>
         <w:pStyle w:val="Heading2"/>
@@ -1048,13 +1048,223 @@
       </w:r>
     </w:p>
     <w:bookmarkEnd w:id="25"/>
-    <w:bookmarkStart w:id="26" w:name="X3a19fa78caea9fc1caedfcebe0bb48fb78e7a72"/>
+    <w:bookmarkStart w:id="26" w:name="X38adfeda0fc8a0184eb343381131eeb57544a75"/>
     <w:p>
       <w:pPr>
         <w:pStyle w:val="Heading3"/>
       </w:pPr>
       <w:r>
-        <w:t xml:space="preserve">1.5 Como o app mede o seu progresso</w:t>
+        <w:t xml:space="preserve">1.4.1 Sugestões enquanto digita (autocompletar)</w:t>
+      </w:r>
+    </w:p>
+    <w:p>
+      <w:pPr>
+        <w:pStyle w:val="FirstParagraph"/>
+      </w:pPr>
+      <w:r>
+        <w:t xml:space="preserve">Ao começar a escrever uma palavra no editor, aparece uma lista de opções: variáveis do seu código,</w:t>
+      </w:r>
+      <w:r>
+        <w:t xml:space="preserve"> </w:t>
+      </w:r>
+      <w:r>
+        <w:rPr>
+          <w:rStyle w:val="VerbatimChar"/>
+        </w:rPr>
+        <w:t xml:space="preserve">console</w:t>
+      </w:r>
+      <w:r>
+        <w:t xml:space="preserve">,</w:t>
+      </w:r>
+      <w:r>
+        <w:t xml:space="preserve"> </w:t>
+      </w:r>
+      <w:r>
+        <w:rPr>
+          <w:rStyle w:val="VerbatimChar"/>
+        </w:rPr>
+        <w:t xml:space="preserve">Math</w:t>
+      </w:r>
+      <w:r>
+        <w:t xml:space="preserve">,</w:t>
+      </w:r>
+      <w:r>
+        <w:t xml:space="preserve"> </w:t>
+      </w:r>
+      <w:r>
+        <w:rPr>
+          <w:rStyle w:val="VerbatimChar"/>
+        </w:rPr>
+        <w:t xml:space="preserve">document</w:t>
+      </w:r>
+      <w:r>
+        <w:t xml:space="preserve">… e</w:t>
+      </w:r>
+      <w:r>
+        <w:t xml:space="preserve"> </w:t>
+      </w:r>
+      <w:r>
+        <w:rPr>
+          <w:bCs/>
+          <w:b/>
+        </w:rPr>
+        <w:t xml:space="preserve">modelos de código prontos</w:t>
+      </w:r>
+      <w:r>
+        <w:t xml:space="preserve"> </w:t>
+      </w:r>
+      <w:r>
+        <w:t xml:space="preserve">(</w:t>
+      </w:r>
+      <w:r>
+        <w:rPr>
+          <w:rStyle w:val="VerbatimChar"/>
+        </w:rPr>
+        <w:t xml:space="preserve">for</w:t>
+      </w:r>
+      <w:r>
+        <w:t xml:space="preserve">,</w:t>
+      </w:r>
+      <w:r>
+        <w:t xml:space="preserve"> </w:t>
+      </w:r>
+      <w:r>
+        <w:rPr>
+          <w:rStyle w:val="VerbatimChar"/>
+        </w:rPr>
+        <w:t xml:space="preserve">forof</w:t>
+      </w:r>
+      <w:r>
+        <w:t xml:space="preserve">,</w:t>
+      </w:r>
+      <w:r>
+        <w:t xml:space="preserve"> </w:t>
+      </w:r>
+      <w:r>
+        <w:rPr>
+          <w:rStyle w:val="VerbatimChar"/>
+        </w:rPr>
+        <w:t xml:space="preserve">if</w:t>
+      </w:r>
+      <w:r>
+        <w:t xml:space="preserve">,</w:t>
+      </w:r>
+      <w:r>
+        <w:t xml:space="preserve"> </w:t>
+      </w:r>
+      <w:r>
+        <w:rPr>
+          <w:rStyle w:val="VerbatimChar"/>
+        </w:rPr>
+        <w:t xml:space="preserve">ifelse</w:t>
+      </w:r>
+      <w:r>
+        <w:t xml:space="preserve">,</w:t>
+      </w:r>
+      <w:r>
+        <w:t xml:space="preserve"> </w:t>
+      </w:r>
+      <w:r>
+        <w:rPr>
+          <w:rStyle w:val="VerbatimChar"/>
+        </w:rPr>
+        <w:t xml:space="preserve">function</w:t>
+      </w:r>
+      <w:r>
+        <w:t xml:space="preserve">,</w:t>
+      </w:r>
+      <w:r>
+        <w:t xml:space="preserve"> </w:t>
+      </w:r>
+      <w:r>
+        <w:rPr>
+          <w:rStyle w:val="VerbatimChar"/>
+        </w:rPr>
+        <w:t xml:space="preserve">arrow</w:t>
+      </w:r>
+      <w:r>
+        <w:t xml:space="preserve">,</w:t>
+      </w:r>
+      <w:r>
+        <w:t xml:space="preserve"> </w:t>
+      </w:r>
+      <w:r>
+        <w:rPr>
+          <w:rStyle w:val="VerbatimChar"/>
+        </w:rPr>
+        <w:t xml:space="preserve">class</w:t>
+      </w:r>
+      <w:r>
+        <w:t xml:space="preserve">,</w:t>
+      </w:r>
+      <w:r>
+        <w:t xml:space="preserve"> </w:t>
+      </w:r>
+      <w:r>
+        <w:rPr>
+          <w:rStyle w:val="VerbatimChar"/>
+        </w:rPr>
+        <w:t xml:space="preserve">try</w:t>
+      </w:r>
+      <w:r>
+        <w:t xml:space="preserve">,</w:t>
+      </w:r>
+      <w:r>
+        <w:t xml:space="preserve"> </w:t>
+      </w:r>
+      <w:r>
+        <w:rPr>
+          <w:rStyle w:val="VerbatimChar"/>
+        </w:rPr>
+        <w:t xml:space="preserve">async</w:t>
+      </w:r>
+      <w:r>
+        <w:t xml:space="preserve">,</w:t>
+      </w:r>
+      <w:r>
+        <w:t xml:space="preserve"> </w:t>
+      </w:r>
+      <w:r>
+        <w:rPr>
+          <w:rStyle w:val="VerbatimChar"/>
+        </w:rPr>
+        <w:t xml:space="preserve">evento</w:t>
+      </w:r>
+      <w:r>
+        <w:t xml:space="preserve">…). Depois de um ponto (</w:t>
+      </w:r>
+      <w:r>
+        <w:rPr>
+          <w:rStyle w:val="VerbatimChar"/>
+        </w:rPr>
+        <w:t xml:space="preserve">lista.</w:t>
+      </w:r>
+      <w:r>
+        <w:t xml:space="preserve">,</w:t>
+      </w:r>
+      <w:r>
+        <w:t xml:space="preserve"> </w:t>
+      </w:r>
+      <w:r>
+        <w:rPr>
+          <w:rStyle w:val="VerbatimChar"/>
+        </w:rPr>
+        <w:t xml:space="preserve">texto.</w:t>
+      </w:r>
+      <w:r>
+        <w:t xml:space="preserve">,</w:t>
+      </w:r>
+      <w:r>
+        <w:t xml:space="preserve"> </w:t>
+      </w:r>
+      <w:r>
+        <w:rPr>
+          <w:rStyle w:val="VerbatimChar"/>
+        </w:rPr>
+        <w:t xml:space="preserve">Math.</w:t>
+      </w:r>
+      <w:r>
+        <w:t xml:space="preserve">) aparecem os métodos mais usados, cada um com uma explicação curta.</w:t>
       </w:r>
     </w:p>
     <w:p>
@@ -1070,10 +1280,45 @@
           <w:bCs/>
           <w:b/>
         </w:rPr>
-        <w:t xml:space="preserve">Nota do exercício (0–100%)</w:t>
-      </w:r>
-      <w:r>
-        <w:t xml:space="preserve">: 100% se resolveu sozinho e com poucas tentativas. Cai com dicas, muitas tentativas e, principalmente, ao ver a solução. Sobe quando você acerta nas revisões.</w:t>
+        <w:t xml:space="preserve">Enter</w:t>
+      </w:r>
+      <w:r>
+        <w:t xml:space="preserve"> </w:t>
+      </w:r>
+      <w:r>
+        <w:t xml:space="preserve">ou</w:t>
+      </w:r>
+      <w:r>
+        <w:t xml:space="preserve"> </w:t>
+      </w:r>
+      <w:r>
+        <w:rPr>
+          <w:bCs/>
+          <w:b/>
+        </w:rPr>
+        <w:t xml:space="preserve">Tab</w:t>
+      </w:r>
+      <w:r>
+        <w:t xml:space="preserve"> </w:t>
+      </w:r>
+      <w:r>
+        <w:t xml:space="preserve">aceita; nos modelos,</w:t>
+      </w:r>
+      <w:r>
+        <w:t xml:space="preserve"> </w:t>
+      </w:r>
+      <w:r>
+        <w:rPr>
+          <w:bCs/>
+          <w:b/>
+        </w:rPr>
+        <w:t xml:space="preserve">Tab</w:t>
+      </w:r>
+      <w:r>
+        <w:t xml:space="preserve"> </w:t>
+      </w:r>
+      <w:r>
+        <w:t xml:space="preserve">pula para o próximo campo a preencher.</w:t>
       </w:r>
     </w:p>
     <w:p>
@@ -1089,10 +1334,13 @@
           <w:bCs/>
           <w:b/>
         </w:rPr>
-        <w:t xml:space="preserve">Domínio por tópico</w:t>
-      </w:r>
-      <w:r>
-        <w:t xml:space="preserve">: média das notas dos exercícios que você tentou naquele tópico. Abaixo de 75%, o tópico aparece em</w:t>
+        <w:t xml:space="preserve">Ctrl+Espaço</w:t>
+      </w:r>
+      <w:r>
+        <w:t xml:space="preserve"> </w:t>
+      </w:r>
+      <w:r>
+        <w:t xml:space="preserve">ou o botão</w:t>
       </w:r>
       <w:r>
         <w:t xml:space="preserve"> </w:t>
@@ -1102,10 +1350,13 @@
           <w:bCs/>
           <w:b/>
         </w:rPr>
-        <w:t xml:space="preserve">Onde focar</w:t>
-      </w:r>
-      <w:r>
-        <w:t xml:space="preserve">.</w:t>
+        <w:t xml:space="preserve">💡</w:t>
+      </w:r>
+      <w:r>
+        <w:t xml:space="preserve"> </w:t>
+      </w:r>
+      <w:r>
+        <w:t xml:space="preserve">da barra de símbolos mostra os modelos mesmo sem ter digitado nada.</w:t>
       </w:r>
     </w:p>
     <w:p>
@@ -1117,253 +1368,33 @@
         <w:pStyle w:val="Compact"/>
       </w:pPr>
       <w:r>
+        <w:t xml:space="preserve">Em</w:t>
+      </w:r>
+      <w:r>
+        <w:t xml:space="preserve"> </w:t>
+      </w:r>
+      <w:r>
         <w:rPr>
           <w:bCs/>
           <w:b/>
         </w:rPr>
-        <w:t xml:space="preserve">Cobertura</w:t>
-      </w:r>
-      <w:r>
-        <w:t xml:space="preserve">: quantos exercícios do tópico você já resolveu.</w:t>
-      </w:r>
-    </w:p>
-    <w:p>
-      <w:pPr>
-        <w:numPr>
-          <w:ilvl w:val="0"/>
-          <w:numId w:val="1004"/>
-        </w:numPr>
-        <w:pStyle w:val="Compact"/>
-      </w:pPr>
-      <w:r>
-        <w:rPr>
-          <w:bCs/>
-          <w:b/>
-        </w:rPr>
-        <w:t xml:space="preserve">Dia concluído</w:t>
-      </w:r>
-      <w:r>
-        <w:t xml:space="preserve">: 80% dos exercícios resolvidos</w:t>
-      </w:r>
-      <w:r>
-        <w:t xml:space="preserve"> </w:t>
-      </w:r>
-      <w:r>
-        <w:rPr>
-          <w:bCs/>
-          <w:b/>
-        </w:rPr>
-        <w:t xml:space="preserve">e</w:t>
-      </w:r>
-      <w:r>
-        <w:t xml:space="preserve"> </w:t>
-      </w:r>
-      <w:r>
-        <w:t xml:space="preserve">quiz com 70% ou mais.</w:t>
-      </w:r>
-    </w:p>
-    <w:p>
-      <w:pPr>
-        <w:numPr>
-          <w:ilvl w:val="0"/>
-          <w:numId w:val="1004"/>
-        </w:numPr>
-        <w:pStyle w:val="Compact"/>
-      </w:pPr>
-      <w:r>
-        <w:rPr>
-          <w:bCs/>
-          <w:b/>
-        </w:rPr>
-        <w:t xml:space="preserve">Progresso da trilha</w:t>
-      </w:r>
-      <w:r>
-        <w:t xml:space="preserve">: 85% exercícios + 15% quizzes.</w:t>
-      </w:r>
-    </w:p>
-    <w:p>
-      <w:pPr>
-        <w:numPr>
-          <w:ilvl w:val="0"/>
-          <w:numId w:val="1004"/>
-        </w:numPr>
-        <w:pStyle w:val="Compact"/>
-      </w:pPr>
-      <w:r>
-        <w:rPr>
-          <w:bCs/>
-          <w:b/>
-        </w:rPr>
-        <w:t xml:space="preserve">Em dia / atrasado</w:t>
-      </w:r>
-      <w:r>
-        <w:t xml:space="preserve">: compara o dia em que você está com a data de início da trilha (ajustável em Conta).</w:t>
-      </w:r>
-    </w:p>
-    <w:p>
-      <w:pPr>
-        <w:numPr>
-          <w:ilvl w:val="0"/>
-          <w:numId w:val="1004"/>
-        </w:numPr>
-        <w:pStyle w:val="Compact"/>
-      </w:pPr>
-      <w:r>
-        <w:rPr>
-          <w:bCs/>
-          <w:b/>
-        </w:rPr>
-        <w:t xml:space="preserve">Tempo de estudo</w:t>
-      </w:r>
-      <w:r>
-        <w:t xml:space="preserve">: conta apenas o tempo ativo (aba aberta e interação nos últimos 2 minutos).</w:t>
-      </w:r>
-    </w:p>
-    <w:p>
-      <w:pPr>
-        <w:numPr>
-          <w:ilvl w:val="0"/>
-          <w:numId w:val="1004"/>
-        </w:numPr>
-        <w:pStyle w:val="Compact"/>
-      </w:pPr>
-      <w:r>
-        <w:rPr>
-          <w:bCs/>
-          <w:b/>
-        </w:rPr>
-        <w:t xml:space="preserve">Sequência 🔥</w:t>
-      </w:r>
-      <w:r>
-        <w:t xml:space="preserve">: dias seguidos com pelo menos 5 minutos de estudo ou um exercício resolvido.</w:t>
-      </w:r>
-    </w:p>
-    <w:p>
-      <w:pPr>
-        <w:numPr>
-          <w:ilvl w:val="0"/>
-          <w:numId w:val="1004"/>
-        </w:numPr>
-        <w:pStyle w:val="Compact"/>
-      </w:pPr>
-      <w:r>
-        <w:rPr>
-          <w:bCs/>
-          <w:b/>
-        </w:rPr>
-        <w:t xml:space="preserve">Tipos de erro</w:t>
-      </w:r>
-      <w:r>
-        <w:t xml:space="preserve">: cada execução com erro é classificada (nome de variável errado, acesso a</w:t>
-      </w:r>
-      <w:r>
-        <w:t xml:space="preserve"> </w:t>
-      </w:r>
-      <w:r>
-        <w:rPr>
-          <w:rStyle w:val="VerbatimChar"/>
-        </w:rPr>
-        <w:t xml:space="preserve">undefined</w:t>
-      </w:r>
-      <w:r>
-        <w:t xml:space="preserve">, sintaxe, loop infinito, resultado errado…) para mostrar seus padrões.</w:t>
+        <w:t xml:space="preserve">Minha conta → Editor de código</w:t>
+      </w:r>
+      <w:r>
+        <w:t xml:space="preserve"> </w:t>
+      </w:r>
+      <w:r>
+        <w:t xml:space="preserve">dá para desligar as sugestões automáticas (treinar sem ajuda fixa melhor a memória).</w:t>
       </w:r>
     </w:p>
     <w:bookmarkEnd w:id="26"/>
-    <w:bookmarkStart w:id="27" w:name="X988e99aa4434a350087c97c8c6c34ead8080ff8"/>
+    <w:bookmarkStart w:id="27" w:name="X3a19fa78caea9fc1caedfcebe0bb48fb78e7a72"/>
     <w:p>
       <w:pPr>
         <w:pStyle w:val="Heading3"/>
       </w:pPr>
       <w:r>
-        <w:t xml:space="preserve">1.5.1 Travou? Veja um vídeo</w:t>
-      </w:r>
-    </w:p>
-    <w:p>
-      <w:pPr>
-        <w:pStyle w:val="FirstParagraph"/>
-      </w:pPr>
-      <w:r>
-        <w:t xml:space="preserve">Quando você erra o mesmo exercício 3 vezes, abre 2 dicas ou vê a solução, aparece o botão</w:t>
-      </w:r>
-      <w:r>
-        <w:t xml:space="preserve"> </w:t>
-      </w:r>
-      <w:r>
-        <w:rPr>
-          <w:bCs/>
-          <w:b/>
-        </w:rPr>
-        <w:t xml:space="preserve">🎬 Veja um vídeo</w:t>
-      </w:r>
-      <w:r>
-        <w:t xml:space="preserve">: uma aula em português no YouTube sobre o assunto do exercício. Os tópicos em “Onde focar”, no Painel, também têm o botão. A lista de vídeos fica em</w:t>
-      </w:r>
-      <w:r>
-        <w:t xml:space="preserve"> </w:t>
-      </w:r>
-      <w:r>
-        <w:rPr>
-          <w:rStyle w:val="VerbatimChar"/>
-        </w:rPr>
-        <w:t xml:space="preserve">src/content/videos.js</w:t>
-      </w:r>
-      <w:r>
-        <w:t xml:space="preserve">.</w:t>
-      </w:r>
-    </w:p>
-    <w:bookmarkEnd w:id="27"/>
-    <w:bookmarkStart w:id="28" w:name="Xa2199fed55e83910699e0586fcdf3d18c3b1524"/>
-    <w:p>
-      <w:pPr>
-        <w:pStyle w:val="Heading3"/>
-      </w:pPr>
-      <w:r>
-        <w:t xml:space="preserve">1.6 Revisão espaçada</w:t>
-      </w:r>
-    </w:p>
-    <w:p>
-      <w:pPr>
-        <w:pStyle w:val="FirstParagraph"/>
-      </w:pPr>
-      <w:r>
-        <w:t xml:space="preserve">Cada exercício resolvido volta na aba</w:t>
-      </w:r>
-      <w:r>
-        <w:t xml:space="preserve"> </w:t>
-      </w:r>
-      <w:r>
-        <w:rPr>
-          <w:bCs/>
-          <w:b/>
-        </w:rPr>
-        <w:t xml:space="preserve">Revisão</w:t>
-      </w:r>
-      <w:r>
-        <w:t xml:space="preserve">: em 3 dias se você foi bem, ou no dia seguinte se usou a solução. A cada revisão bem-sucedida</w:t>
-      </w:r>
-      <w:r>
-        <w:t xml:space="preserve"> </w:t>
-      </w:r>
-      <w:r>
-        <w:rPr>
-          <w:bCs/>
-          <w:b/>
-        </w:rPr>
-        <w:t xml:space="preserve">sem ajuda</w:t>
-      </w:r>
-      <w:r>
-        <w:t xml:space="preserve">, o intervalo cresce (cerca de 2,5×). Na revisão o editor começa vazio: você precisa lembrar. É isso que fixa o conhecimento.</w:t>
-      </w:r>
-    </w:p>
-    <w:bookmarkEnd w:id="28"/>
-    <w:bookmarkStart w:id="29" w:name="X4993205f7ddd48ffa8f14ae56148930e45e47ef"/>
-    <w:p>
-      <w:pPr>
-        <w:pStyle w:val="Heading3"/>
-      </w:pPr>
-      <w:r>
-        <w:t xml:space="preserve">1.7 Rotina recomendada (3–4 h/dia)</w:t>
+        <w:t xml:space="preserve">1.5 Como o app mede o seu progresso</w:t>
       </w:r>
     </w:p>
     <w:p>
@@ -1375,11 +1406,320 @@
         <w:pStyle w:val="Compact"/>
       </w:pPr>
       <w:r>
+        <w:rPr>
+          <w:bCs/>
+          <w:b/>
+        </w:rPr>
+        <w:t xml:space="preserve">Nota do exercício (0–100%)</w:t>
+      </w:r>
+      <w:r>
+        <w:t xml:space="preserve">: 100% se resolveu sozinho e com poucas tentativas. Cai com dicas, muitas tentativas e, principalmente, ao ver a solução. Sobe quando você acerta nas revisões.</w:t>
+      </w:r>
+    </w:p>
+    <w:p>
+      <w:pPr>
+        <w:numPr>
+          <w:ilvl w:val="0"/>
+          <w:numId w:val="1005"/>
+        </w:numPr>
+        <w:pStyle w:val="Compact"/>
+      </w:pPr>
+      <w:r>
+        <w:rPr>
+          <w:bCs/>
+          <w:b/>
+        </w:rPr>
+        <w:t xml:space="preserve">Domínio por tópico</w:t>
+      </w:r>
+      <w:r>
+        <w:t xml:space="preserve">: média das notas dos exercícios que você tentou naquele tópico. Abaixo de 75%, o tópico aparece em</w:t>
+      </w:r>
+      <w:r>
+        <w:t xml:space="preserve"> </w:t>
+      </w:r>
+      <w:r>
+        <w:rPr>
+          <w:bCs/>
+          <w:b/>
+        </w:rPr>
+        <w:t xml:space="preserve">Onde focar</w:t>
+      </w:r>
+      <w:r>
+        <w:t xml:space="preserve">.</w:t>
+      </w:r>
+    </w:p>
+    <w:p>
+      <w:pPr>
+        <w:numPr>
+          <w:ilvl w:val="0"/>
+          <w:numId w:val="1005"/>
+        </w:numPr>
+        <w:pStyle w:val="Compact"/>
+      </w:pPr>
+      <w:r>
+        <w:rPr>
+          <w:bCs/>
+          <w:b/>
+        </w:rPr>
+        <w:t xml:space="preserve">Cobertura</w:t>
+      </w:r>
+      <w:r>
+        <w:t xml:space="preserve">: quantos exercícios do tópico você já resolveu.</w:t>
+      </w:r>
+    </w:p>
+    <w:p>
+      <w:pPr>
+        <w:numPr>
+          <w:ilvl w:val="0"/>
+          <w:numId w:val="1005"/>
+        </w:numPr>
+        <w:pStyle w:val="Compact"/>
+      </w:pPr>
+      <w:r>
+        <w:rPr>
+          <w:bCs/>
+          <w:b/>
+        </w:rPr>
+        <w:t xml:space="preserve">Dia concluído</w:t>
+      </w:r>
+      <w:r>
+        <w:t xml:space="preserve">: 80% dos exercícios resolvidos</w:t>
+      </w:r>
+      <w:r>
+        <w:t xml:space="preserve"> </w:t>
+      </w:r>
+      <w:r>
+        <w:rPr>
+          <w:bCs/>
+          <w:b/>
+        </w:rPr>
+        <w:t xml:space="preserve">e</w:t>
+      </w:r>
+      <w:r>
+        <w:t xml:space="preserve"> </w:t>
+      </w:r>
+      <w:r>
+        <w:t xml:space="preserve">quiz com 70% ou mais.</w:t>
+      </w:r>
+    </w:p>
+    <w:p>
+      <w:pPr>
+        <w:numPr>
+          <w:ilvl w:val="0"/>
+          <w:numId w:val="1005"/>
+        </w:numPr>
+        <w:pStyle w:val="Compact"/>
+      </w:pPr>
+      <w:r>
+        <w:rPr>
+          <w:bCs/>
+          <w:b/>
+        </w:rPr>
+        <w:t xml:space="preserve">Progresso da trilha</w:t>
+      </w:r>
+      <w:r>
+        <w:t xml:space="preserve">: 85% exercícios + 15% quizzes.</w:t>
+      </w:r>
+    </w:p>
+    <w:p>
+      <w:pPr>
+        <w:numPr>
+          <w:ilvl w:val="0"/>
+          <w:numId w:val="1005"/>
+        </w:numPr>
+        <w:pStyle w:val="Compact"/>
+      </w:pPr>
+      <w:r>
+        <w:rPr>
+          <w:bCs/>
+          <w:b/>
+        </w:rPr>
+        <w:t xml:space="preserve">Em dia / atrasado</w:t>
+      </w:r>
+      <w:r>
+        <w:t xml:space="preserve">: compara o dia em que você está com a data de início da trilha (ajustável em Conta).</w:t>
+      </w:r>
+    </w:p>
+    <w:p>
+      <w:pPr>
+        <w:numPr>
+          <w:ilvl w:val="0"/>
+          <w:numId w:val="1005"/>
+        </w:numPr>
+        <w:pStyle w:val="Compact"/>
+      </w:pPr>
+      <w:r>
+        <w:rPr>
+          <w:bCs/>
+          <w:b/>
+        </w:rPr>
+        <w:t xml:space="preserve">Tempo de estudo</w:t>
+      </w:r>
+      <w:r>
+        <w:t xml:space="preserve">: conta apenas o tempo ativo (aba aberta e interação nos últimos 2 minutos).</w:t>
+      </w:r>
+    </w:p>
+    <w:p>
+      <w:pPr>
+        <w:numPr>
+          <w:ilvl w:val="0"/>
+          <w:numId w:val="1005"/>
+        </w:numPr>
+        <w:pStyle w:val="Compact"/>
+      </w:pPr>
+      <w:r>
+        <w:rPr>
+          <w:bCs/>
+          <w:b/>
+        </w:rPr>
+        <w:t xml:space="preserve">Sequência 🔥</w:t>
+      </w:r>
+      <w:r>
+        <w:t xml:space="preserve">: dias seguidos com pelo menos 5 minutos de estudo ou um exercício resolvido.</w:t>
+      </w:r>
+    </w:p>
+    <w:p>
+      <w:pPr>
+        <w:numPr>
+          <w:ilvl w:val="0"/>
+          <w:numId w:val="1005"/>
+        </w:numPr>
+        <w:pStyle w:val="Compact"/>
+      </w:pPr>
+      <w:r>
+        <w:rPr>
+          <w:bCs/>
+          <w:b/>
+        </w:rPr>
+        <w:t xml:space="preserve">Tipos de erro</w:t>
+      </w:r>
+      <w:r>
+        <w:t xml:space="preserve">: cada execução com erro é classificada (nome de variável errado, acesso a</w:t>
+      </w:r>
+      <w:r>
+        <w:t xml:space="preserve"> </w:t>
+      </w:r>
+      <w:r>
+        <w:rPr>
+          <w:rStyle w:val="VerbatimChar"/>
+        </w:rPr>
+        <w:t xml:space="preserve">undefined</w:t>
+      </w:r>
+      <w:r>
+        <w:t xml:space="preserve">, sintaxe, loop infinito, resultado errado…) para mostrar seus padrões.</w:t>
+      </w:r>
+    </w:p>
+    <w:bookmarkEnd w:id="27"/>
+    <w:bookmarkStart w:id="28" w:name="X988e99aa4434a350087c97c8c6c34ead8080ff8"/>
+    <w:p>
+      <w:pPr>
+        <w:pStyle w:val="Heading3"/>
+      </w:pPr>
+      <w:r>
+        <w:t xml:space="preserve">1.5.1 Travou? Veja um vídeo</w:t>
+      </w:r>
+    </w:p>
+    <w:p>
+      <w:pPr>
+        <w:pStyle w:val="FirstParagraph"/>
+      </w:pPr>
+      <w:r>
+        <w:t xml:space="preserve">Quando você erra o mesmo exercício 3 vezes, abre 2 dicas ou vê a solução, aparece o botão</w:t>
+      </w:r>
+      <w:r>
+        <w:t xml:space="preserve"> </w:t>
+      </w:r>
+      <w:r>
+        <w:rPr>
+          <w:bCs/>
+          <w:b/>
+        </w:rPr>
+        <w:t xml:space="preserve">🎬 Veja um vídeo</w:t>
+      </w:r>
+      <w:r>
+        <w:t xml:space="preserve">: uma aula em português no YouTube sobre o assunto do exercício. Os tópicos em “Onde focar”, no Painel, também têm o botão. A lista de vídeos fica em</w:t>
+      </w:r>
+      <w:r>
+        <w:t xml:space="preserve"> </w:t>
+      </w:r>
+      <w:r>
+        <w:rPr>
+          <w:rStyle w:val="VerbatimChar"/>
+        </w:rPr>
+        <w:t xml:space="preserve">src/content/videos.js</w:t>
+      </w:r>
+      <w:r>
+        <w:t xml:space="preserve">.</w:t>
+      </w:r>
+    </w:p>
+    <w:bookmarkEnd w:id="28"/>
+    <w:bookmarkStart w:id="29" w:name="Xa2199fed55e83910699e0586fcdf3d18c3b1524"/>
+    <w:p>
+      <w:pPr>
+        <w:pStyle w:val="Heading3"/>
+      </w:pPr>
+      <w:r>
+        <w:t xml:space="preserve">1.6 Revisão espaçada</w:t>
+      </w:r>
+    </w:p>
+    <w:p>
+      <w:pPr>
+        <w:pStyle w:val="FirstParagraph"/>
+      </w:pPr>
+      <w:r>
+        <w:t xml:space="preserve">Cada exercício resolvido volta na aba</w:t>
+      </w:r>
+      <w:r>
+        <w:t xml:space="preserve"> </w:t>
+      </w:r>
+      <w:r>
+        <w:rPr>
+          <w:bCs/>
+          <w:b/>
+        </w:rPr>
+        <w:t xml:space="preserve">Revisão</w:t>
+      </w:r>
+      <w:r>
+        <w:t xml:space="preserve">: em 3 dias se você foi bem, ou no dia seguinte se usou a solução. A cada revisão bem-sucedida</w:t>
+      </w:r>
+      <w:r>
+        <w:t xml:space="preserve"> </w:t>
+      </w:r>
+      <w:r>
+        <w:rPr>
+          <w:bCs/>
+          <w:b/>
+        </w:rPr>
+        <w:t xml:space="preserve">sem ajuda</w:t>
+      </w:r>
+      <w:r>
+        <w:t xml:space="preserve">, o intervalo cresce (cerca de 2,5×). Na revisão o editor começa vazio: você precisa lembrar. É isso que fixa o conhecimento.</w:t>
+      </w:r>
+    </w:p>
+    <w:bookmarkEnd w:id="29"/>
+    <w:bookmarkStart w:id="30" w:name="X4993205f7ddd48ffa8f14ae56148930e45e47ef"/>
+    <w:p>
+      <w:pPr>
+        <w:pStyle w:val="Heading3"/>
+      </w:pPr>
+      <w:r>
+        <w:t xml:space="preserve">1.7 Rotina recomendada (3–4 h/dia)</w:t>
+      </w:r>
+    </w:p>
+    <w:p>
+      <w:pPr>
+        <w:numPr>
+          <w:ilvl w:val="0"/>
+          <w:numId w:val="1006"/>
+        </w:numPr>
+        <w:pStyle w:val="Compact"/>
+      </w:pPr>
+      <w:r>
         <w:t xml:space="preserve">Revisões pendentes (10 min) → 2. Aula testando os exemplos (40–50 min) → 3. Exercícios (1h30–2h) → 4. Quiz (10 min) → 5. Diário (5 min). Pausas a cada 25–50 min.</w:t>
       </w:r>
     </w:p>
-    <w:bookmarkEnd w:id="29"/>
-    <w:bookmarkStart w:id="30" w:name="X6dc8f0d5356e8c16fdafb532c4c24c34aaba0ec"/>
+    <w:bookmarkEnd w:id="30"/>
+    <w:bookmarkStart w:id="31" w:name="X6dc8f0d5356e8c16fdafb532c4c24c34aaba0ec"/>
     <w:p>
       <w:pPr>
         <w:pStyle w:val="Heading3"/>
@@ -1561,9 +1901,9 @@
         </w:pict>
       </w:r>
     </w:p>
-    <w:bookmarkEnd w:id="30"/>
     <w:bookmarkEnd w:id="31"/>
-    <w:bookmarkStart w:id="41" w:name="parte-2--documentação-técnica"/>
+    <w:bookmarkEnd w:id="32"/>
+    <w:bookmarkStart w:id="42" w:name="parte-2--documentação-técnica"/>
     <w:p>
       <w:pPr>
         <w:pStyle w:val="Heading2"/>
@@ -1572,7 +1912,7 @@
         <w:t xml:space="preserve">Parte 2 — Documentação técnica</w:t>
       </w:r>
     </w:p>
-    <w:bookmarkStart w:id="32" w:name="X2b521c1e9cc8a05ed18f782e716115ddc052798"/>
+    <w:bookmarkStart w:id="33" w:name="X2b521c1e9cc8a05ed18f782e716115ddc052798"/>
     <w:p>
       <w:pPr>
         <w:pStyle w:val="Heading3"/>
@@ -1871,8 +2211,8 @@
         </w:tc>
       </w:tr>
     </w:tbl>
-    <w:bookmarkEnd w:id="32"/>
-    <w:bookmarkStart w:id="33" w:name="X8196d7790687983162b23032d232afd9a98e67d"/>
+    <w:bookmarkEnd w:id="33"/>
+    <w:bookmarkStart w:id="34" w:name="X8196d7790687983162b23032d232afd9a98e67d"/>
     <w:p>
       <w:pPr>
         <w:pStyle w:val="Heading3"/>
@@ -2108,394 +2448,14 @@
         <w:t xml:space="preserve">docs/                apostila, documentação, revisão do projeto</w:t>
       </w:r>
     </w:p>
-    <w:bookmarkEnd w:id="33"/>
-    <w:bookmarkStart w:id="34" w:name="Xb583d11f78fbb8ef43b188a057facf38f0675dc"/>
+    <w:bookmarkEnd w:id="34"/>
+    <w:bookmarkStart w:id="35" w:name="Xb583d11f78fbb8ef43b188a057facf38f0675dc"/>
     <w:p>
       <w:pPr>
         <w:pStyle w:val="Heading3"/>
       </w:pPr>
       <w:r>
         <w:t xml:space="preserve">2.3 Como o código do aluno é executado</w:t>
-      </w:r>
-    </w:p>
-    <w:p>
-      <w:pPr>
-        <w:numPr>
-          <w:ilvl w:val="0"/>
-          <w:numId w:val="1006"/>
-        </w:numPr>
-        <w:pStyle w:val="Compact"/>
-      </w:pPr>
-      <w:r>
-        <w:t xml:space="preserve">A tela envia</w:t>
-      </w:r>
-      <w:r>
-        <w:t xml:space="preserve"> </w:t>
-      </w:r>
-      <w:r>
-        <w:rPr>
-          <w:rStyle w:val="VerbatimChar"/>
-        </w:rPr>
-        <w:t xml:space="preserve">{ code, tests, checks, env, html }</w:t>
-      </w:r>
-      <w:r>
-        <w:t xml:space="preserve"> </w:t>
-      </w:r>
-      <w:r>
-        <w:t xml:space="preserve">para</w:t>
-      </w:r>
-      <w:r>
-        <w:t xml:space="preserve"> </w:t>
-      </w:r>
-      <w:r>
-        <w:rPr>
-          <w:rStyle w:val="VerbatimChar"/>
-        </w:rPr>
-        <w:t xml:space="preserve">sandbox.js</w:t>
-      </w:r>
-      <w:r>
-        <w:t xml:space="preserve">.</w:t>
-      </w:r>
-    </w:p>
-    <w:p>
-      <w:pPr>
-        <w:numPr>
-          <w:ilvl w:val="0"/>
-          <w:numId w:val="1006"/>
-        </w:numPr>
-        <w:pStyle w:val="Compact"/>
-      </w:pPr>
-      <w:r>
-        <w:t xml:space="preserve">Em produção, um</w:t>
-      </w:r>
-      <w:r>
-        <w:t xml:space="preserve"> </w:t>
-      </w:r>
-      <w:r>
-        <w:rPr>
-          <w:rStyle w:val="VerbatimChar"/>
-        </w:rPr>
-        <w:t xml:space="preserve">&lt;iframe sandbox="allow-scripts"&gt;</w:t>
-      </w:r>
-      <w:r>
-        <w:t xml:space="preserve"> </w:t>
-      </w:r>
-      <w:r>
-        <w:t xml:space="preserve">(origem opaca) cria um</w:t>
-      </w:r>
-      <w:r>
-        <w:t xml:space="preserve"> </w:t>
-      </w:r>
-      <w:r>
-        <w:rPr>
-          <w:bCs/>
-          <w:b/>
-        </w:rPr>
-        <w:t xml:space="preserve">Web Worker novo a cada execução</w:t>
-      </w:r>
-      <w:r>
-        <w:t xml:space="preserve">. O código não acessa o login, o</w:t>
-      </w:r>
-      <w:r>
-        <w:t xml:space="preserve"> </w:t>
-      </w:r>
-      <w:r>
-        <w:rPr>
-          <w:rStyle w:val="VerbatimChar"/>
-        </w:rPr>
-        <w:t xml:space="preserve">localStorage</w:t>
-      </w:r>
-      <w:r>
-        <w:t xml:space="preserve"> </w:t>
-      </w:r>
-      <w:r>
-        <w:t xml:space="preserve">nem o IndexedDB do app.</w:t>
-      </w:r>
-    </w:p>
-    <w:p>
-      <w:pPr>
-        <w:numPr>
-          <w:ilvl w:val="0"/>
-          <w:numId w:val="1006"/>
-        </w:numPr>
-        <w:pStyle w:val="Compact"/>
-      </w:pPr>
-      <w:r>
-        <w:rPr>
-          <w:rStyle w:val="VerbatimChar"/>
-        </w:rPr>
-        <w:t xml:space="preserve">runtime.js</w:t>
-      </w:r>
-      <w:r>
-        <w:t xml:space="preserve"> </w:t>
-      </w:r>
-      <w:r>
-        <w:t xml:space="preserve">monta uma função com o código do aluno em</w:t>
-      </w:r>
-      <w:r>
-        <w:t xml:space="preserve"> </w:t>
-      </w:r>
-      <w:r>
-        <w:rPr>
-          <w:bCs/>
-          <w:b/>
-        </w:rPr>
-        <w:t xml:space="preserve">modo estrito</w:t>
-      </w:r>
-      <w:r>
-        <w:t xml:space="preserve">, injeta</w:t>
-      </w:r>
-      <w:r>
-        <w:t xml:space="preserve"> </w:t>
-      </w:r>
-      <w:r>
-        <w:rPr>
-          <w:rStyle w:val="VerbatimChar"/>
-        </w:rPr>
-        <w:t xml:space="preserve">console</w:t>
-      </w:r>
-      <w:r>
-        <w:t xml:space="preserve">,</w:t>
-      </w:r>
-      <w:r>
-        <w:t xml:space="preserve"> </w:t>
-      </w:r>
-      <w:r>
-        <w:rPr>
-          <w:rStyle w:val="VerbatimChar"/>
-        </w:rPr>
-        <w:t xml:space="preserve">setTimeout</w:t>
-      </w:r>
-      <w:r>
-        <w:t xml:space="preserve">/</w:t>
-      </w:r>
-      <w:r>
-        <w:rPr>
-          <w:rStyle w:val="VerbatimChar"/>
-        </w:rPr>
-        <w:t xml:space="preserve">setInterval</w:t>
-      </w:r>
-      <w:r>
-        <w:t xml:space="preserve"> </w:t>
-      </w:r>
-      <w:r>
-        <w:t xml:space="preserve">rastreados e um</w:t>
-      </w:r>
-      <w:r>
-        <w:t xml:space="preserve"> </w:t>
-      </w:r>
-      <w:r>
-        <w:rPr>
-          <w:rStyle w:val="VerbatimChar"/>
-        </w:rPr>
-        <w:t xml:space="preserve">fetch</w:t>
-      </w:r>
-      <w:r>
-        <w:t xml:space="preserve"> </w:t>
-      </w:r>
-      <w:r>
-        <w:t xml:space="preserve">simulado (</w:t>
-      </w:r>
-      <w:r>
-        <w:rPr>
-          <w:rStyle w:val="VerbatimChar"/>
-        </w:rPr>
-        <w:t xml:space="preserve">https://api.exemplo.com/usuarios</w:t>
-      </w:r>
-      <w:r>
-        <w:t xml:space="preserve"> </w:t>
-      </w:r>
-      <w:r>
-        <w:t xml:space="preserve">e</w:t>
-      </w:r>
-      <w:r>
-        <w:t xml:space="preserve"> </w:t>
-      </w:r>
-      <w:r>
-        <w:rPr>
-          <w:rStyle w:val="VerbatimChar"/>
-        </w:rPr>
-        <w:t xml:space="preserve">/produtos</w:t>
-      </w:r>
-      <w:r>
-        <w:t xml:space="preserve">); nos exercícios de DOM injeta também</w:t>
-      </w:r>
-      <w:r>
-        <w:t xml:space="preserve"> </w:t>
-      </w:r>
-      <w:r>
-        <w:rPr>
-          <w:rStyle w:val="VerbatimChar"/>
-        </w:rPr>
-        <w:t xml:space="preserve">document</w:t>
-      </w:r>
-      <w:r>
-        <w:t xml:space="preserve"> </w:t>
-      </w:r>
-      <w:r>
-        <w:t xml:space="preserve">e</w:t>
-      </w:r>
-      <w:r>
-        <w:t xml:space="preserve"> </w:t>
-      </w:r>
-      <w:r>
-        <w:rPr>
-          <w:rStyle w:val="VerbatimChar"/>
-        </w:rPr>
-        <w:t xml:space="preserve">window</w:t>
-      </w:r>
-      <w:r>
-        <w:t xml:space="preserve"> </w:t>
-      </w:r>
-      <w:r>
-        <w:t xml:space="preserve">simulados.</w:t>
-      </w:r>
-    </w:p>
-    <w:p>
-      <w:pPr>
-        <w:numPr>
-          <w:ilvl w:val="0"/>
-          <w:numId w:val="1006"/>
-        </w:numPr>
-        <w:pStyle w:val="Compact"/>
-      </w:pPr>
-      <w:r>
-        <w:t xml:space="preserve">Os testes rodam no mesmo escopo do código e comparam o valor retornado com o esperado (comparação profunda), ou comparam a saída do console.</w:t>
-      </w:r>
-    </w:p>
-    <w:p>
-      <w:pPr>
-        <w:numPr>
-          <w:ilvl w:val="0"/>
-          <w:numId w:val="1006"/>
-        </w:numPr>
-        <w:pStyle w:val="Compact"/>
-      </w:pPr>
-      <w:r>
-        <w:t xml:space="preserve">Limites: 6 s no total (loop infinito é interrompido), 2,5 s para o</w:t>
-      </w:r>
-      <w:r>
-        <w:t xml:space="preserve"> </w:t>
-      </w:r>
-      <w:r>
-        <w:rPr>
-          <w:rStyle w:val="VerbatimChar"/>
-        </w:rPr>
-        <w:t xml:space="preserve">await</w:t>
-      </w:r>
-      <w:r>
-        <w:t xml:space="preserve"> </w:t>
-      </w:r>
-      <w:r>
-        <w:t xml:space="preserve">principal, 1,5 s por teste assíncrono, 300 linhas de console.</w:t>
-      </w:r>
-    </w:p>
-    <w:bookmarkEnd w:id="34"/>
-    <w:bookmarkStart w:id="35" w:name="Xfaba23abf3c054b6d9d3988fdd6609edf0728be"/>
-    <w:p>
-      <w:pPr>
-        <w:pStyle w:val="Heading3"/>
-      </w:pPr>
-      <w:r>
-        <w:t xml:space="preserve">2.4 Modelo de dados (Firestore)</w:t>
-      </w:r>
-    </w:p>
-    <w:p>
-      <w:pPr>
-        <w:pStyle w:val="SourceCode"/>
-      </w:pPr>
-      <w:r>
-        <w:rPr>
-          <w:rStyle w:val="VerbatimChar"/>
-        </w:rPr>
-        <w:t xml:space="preserve">users/{uid}                     name, email, startDate, createdAt, updatedAt</w:t>
-      </w:r>
-      <w:r>
-        <w:br/>
-      </w:r>
-      <w:r>
-        <w:rPr>
-          <w:rStyle w:val="VerbatimChar"/>
-        </w:rPr>
-        <w:t xml:space="preserve">users/{uid}/progress/{exId}     attempts, passed, passedAt, failsBeforePass, hintsUsed,</w:t>
-      </w:r>
-      <w:r>
-        <w:br/>
-      </w:r>
-      <w:r>
-        <w:rPr>
-          <w:rStyle w:val="VerbatimChar"/>
-        </w:rPr>
-        <w:t xml:space="preserve">                                hintsBeforePass, solutionViewed, solutionBeforePass,</w:t>
-      </w:r>
-      <w:r>
-        <w:br/>
-      </w:r>
-      <w:r>
-        <w:rPr>
-          <w:rStyle w:val="VerbatimChar"/>
-        </w:rPr>
-        <w:t xml:space="preserve">                                reviewPasses, errors{tipo: n}, timeSec, lastCode, srs{interval, reps, due}</w:t>
-      </w:r>
-      <w:r>
-        <w:br/>
-      </w:r>
-      <w:r>
-        <w:rPr>
-          <w:rStyle w:val="VerbatimChar"/>
-        </w:rPr>
-        <w:t xml:space="preserve">users/{uid}/quiz/d{dia}         best, last, attempts, wrong[], at</w:t>
-      </w:r>
-      <w:r>
-        <w:br/>
-      </w:r>
-      <w:r>
-        <w:rPr>
-          <w:rStyle w:val="VerbatimChar"/>
-        </w:rPr>
-        <w:t xml:space="preserve">users/{uid}/notes/d{dia}        aprendi, duvidas, goals[], at</w:t>
-      </w:r>
-      <w:r>
-        <w:br/>
-      </w:r>
-      <w:r>
-        <w:rPr>
-          <w:rStyle w:val="VerbatimChar"/>
-        </w:rPr>
-        <w:t xml:space="preserve">users/{uid}/activity/{AAAA-MM-DD}  seconds, solved, attempts</w:t>
-      </w:r>
-    </w:p>
-    <w:p>
-      <w:pPr>
-        <w:pStyle w:val="FirstParagraph"/>
-      </w:pPr>
-      <w:r>
-        <w:t xml:space="preserve">Gravações são agrupadas (cerca de 1,2 s) e enviadas também ao esconder/fechar a aba. Sem Firebase configurado, tudo vai para o</w:t>
-      </w:r>
-      <w:r>
-        <w:t xml:space="preserve"> </w:t>
-      </w:r>
-      <w:r>
-        <w:rPr>
-          <w:rStyle w:val="VerbatimChar"/>
-        </w:rPr>
-        <w:t xml:space="preserve">localStorage</w:t>
-      </w:r>
-      <w:r>
-        <w:t xml:space="preserve"> </w:t>
-      </w:r>
-      <w:r>
-        <w:t xml:space="preserve">(“modo local”).</w:t>
-      </w:r>
-    </w:p>
-    <w:bookmarkEnd w:id="35"/>
-    <w:bookmarkStart w:id="36" w:name="X849eea489b120574476a6d9af7adedbaa368ddd"/>
-    <w:p>
-      <w:pPr>
-        <w:pStyle w:val="Heading3"/>
-      </w:pPr>
-      <w:r>
-        <w:t xml:space="preserve">2.5 Segurança</w:t>
       </w:r>
     </w:p>
     <w:p>
@@ -2507,111 +2467,31 @@
         <w:pStyle w:val="Compact"/>
       </w:pPr>
       <w:r>
-        <w:rPr>
-          <w:bCs/>
-          <w:b/>
-        </w:rPr>
-        <w:t xml:space="preserve">Regras do Firestore</w:t>
-      </w:r>
-      <w:r>
-        <w:t xml:space="preserve"> </w:t>
-      </w:r>
-      <w:r>
-        <w:t xml:space="preserve">(</w:t>
-      </w:r>
-      <w:r>
-        <w:rPr>
-          <w:rStyle w:val="VerbatimChar"/>
-        </w:rPr>
-        <w:t xml:space="preserve">firestore.rules</w:t>
-      </w:r>
-      <w:r>
-        <w:t xml:space="preserve">): cada usuário só lê e grava</w:t>
-      </w:r>
-      <w:r>
-        <w:t xml:space="preserve"> </w:t>
-      </w:r>
-      <w:r>
-        <w:rPr>
-          <w:rStyle w:val="VerbatimChar"/>
-        </w:rPr>
-        <w:t xml:space="preserve">users/{seu uid}</w:t>
-      </w:r>
-      <w:r>
-        <w:t xml:space="preserve">; apenas as coleções</w:t>
-      </w:r>
-      <w:r>
-        <w:t xml:space="preserve"> </w:t>
-      </w:r>
-      <w:r>
-        <w:rPr>
-          <w:rStyle w:val="VerbatimChar"/>
-        </w:rPr>
-        <w:t xml:space="preserve">progress</w:t>
-      </w:r>
-      <w:r>
-        <w:t xml:space="preserve">,</w:t>
-      </w:r>
-      <w:r>
-        <w:t xml:space="preserve"> </w:t>
-      </w:r>
-      <w:r>
-        <w:rPr>
-          <w:rStyle w:val="VerbatimChar"/>
-        </w:rPr>
-        <w:t xml:space="preserve">quiz</w:t>
-      </w:r>
-      <w:r>
-        <w:t xml:space="preserve">,</w:t>
-      </w:r>
-      <w:r>
-        <w:t xml:space="preserve"> </w:t>
-      </w:r>
-      <w:r>
-        <w:rPr>
-          <w:rStyle w:val="VerbatimChar"/>
-        </w:rPr>
-        <w:t xml:space="preserve">notes</w:t>
-      </w:r>
-      <w:r>
-        <w:t xml:space="preserve"> </w:t>
-      </w:r>
-      <w:r>
-        <w:t xml:space="preserve">e</w:t>
-      </w:r>
-      <w:r>
-        <w:t xml:space="preserve"> </w:t>
-      </w:r>
-      <w:r>
-        <w:rPr>
-          <w:rStyle w:val="VerbatimChar"/>
-        </w:rPr>
-        <w:t xml:space="preserve">activity</w:t>
-      </w:r>
-      <w:r>
-        <w:t xml:space="preserve">; limites de tamanho (</w:t>
-      </w:r>
-      <w:r>
-        <w:rPr>
-          <w:rStyle w:val="VerbatimChar"/>
-        </w:rPr>
-        <w:t xml:space="preserve">lastCode</w:t>
-      </w:r>
-      <w:r>
-        <w:t xml:space="preserve"> </w:t>
-      </w:r>
-      <w:r>
-        <w:t xml:space="preserve">≤ 20 000 caracteres; diário ≤ 5 000). Todo o resto é negado. Testado: ler dados de outro usuário, listar usuários, gravar em coleção não permitida e acessar sem login retornam</w:t>
-      </w:r>
-      <w:r>
-        <w:t xml:space="preserve"> </w:t>
-      </w:r>
-      <w:r>
-        <w:rPr>
-          <w:bCs/>
-          <w:b/>
-        </w:rPr>
-        <w:t xml:space="preserve">403</w:t>
+        <w:t xml:space="preserve">A tela envia</w:t>
+      </w:r>
+      <w:r>
+        <w:t xml:space="preserve"> </w:t>
+      </w:r>
+      <w:r>
+        <w:rPr>
+          <w:rStyle w:val="VerbatimChar"/>
+        </w:rPr>
+        <w:t xml:space="preserve">{ code, tests, checks, env, html }</w:t>
+      </w:r>
+      <w:r>
+        <w:t xml:space="preserve"> </w:t>
+      </w:r>
+      <w:r>
+        <w:t xml:space="preserve">para</w:t>
+      </w:r>
+      <w:r>
+        <w:t xml:space="preserve"> </w:t>
+      </w:r>
+      <w:r>
+        <w:rPr>
+          <w:rStyle w:val="VerbatimChar"/>
+        </w:rPr>
+        <w:t xml:space="preserve">sandbox.js</w:t>
       </w:r>
       <w:r>
         <w:t xml:space="preserve">.</w:t>
@@ -2626,30 +2506,50 @@
         <w:pStyle w:val="Compact"/>
       </w:pPr>
       <w:r>
+        <w:t xml:space="preserve">Em produção, um</w:t>
+      </w:r>
+      <w:r>
+        <w:t xml:space="preserve"> </w:t>
+      </w:r>
+      <w:r>
+        <w:rPr>
+          <w:rStyle w:val="VerbatimChar"/>
+        </w:rPr>
+        <w:t xml:space="preserve">&lt;iframe sandbox="allow-scripts"&gt;</w:t>
+      </w:r>
+      <w:r>
+        <w:t xml:space="preserve"> </w:t>
+      </w:r>
+      <w:r>
+        <w:t xml:space="preserve">(origem opaca) cria um</w:t>
+      </w:r>
+      <w:r>
+        <w:t xml:space="preserve"> </w:t>
+      </w:r>
+      <w:r>
         <w:rPr>
           <w:bCs/>
           <w:b/>
         </w:rPr>
-        <w:t xml:space="preserve">Cadastro aberto</w:t>
-      </w:r>
-      <w:r>
-        <w:t xml:space="preserve">, com política de senha do Firebase e e-mail de confirmação. Recomendado:</w:t>
-      </w:r>
-      <w:r>
-        <w:t xml:space="preserve"> </w:t>
-      </w:r>
-      <w:r>
-        <w:rPr>
-          <w:iCs/>
-          <w:i/>
-        </w:rPr>
-        <w:t xml:space="preserve">Sign-up quota</w:t>
-      </w:r>
-      <w:r>
-        <w:t xml:space="preserve"> </w:t>
-      </w:r>
-      <w:r>
-        <w:t xml:space="preserve">por IP.</w:t>
+        <w:t xml:space="preserve">Web Worker novo a cada execução</w:t>
+      </w:r>
+      <w:r>
+        <w:t xml:space="preserve">. O código não acessa o login, o</w:t>
+      </w:r>
+      <w:r>
+        <w:t xml:space="preserve"> </w:t>
+      </w:r>
+      <w:r>
+        <w:rPr>
+          <w:rStyle w:val="VerbatimChar"/>
+        </w:rPr>
+        <w:t xml:space="preserve">localStorage</w:t>
+      </w:r>
+      <w:r>
+        <w:t xml:space="preserve"> </w:t>
+      </w:r>
+      <w:r>
+        <w:t xml:space="preserve">nem o IndexedDB do app.</w:t>
       </w:r>
     </w:p>
     <w:p>
@@ -2662,13 +2562,133 @@
       </w:pPr>
       <w:r>
         <w:rPr>
+          <w:rStyle w:val="VerbatimChar"/>
+        </w:rPr>
+        <w:t xml:space="preserve">runtime.js</w:t>
+      </w:r>
+      <w:r>
+        <w:t xml:space="preserve"> </w:t>
+      </w:r>
+      <w:r>
+        <w:t xml:space="preserve">monta uma função com o código do aluno em</w:t>
+      </w:r>
+      <w:r>
+        <w:t xml:space="preserve"> </w:t>
+      </w:r>
+      <w:r>
+        <w:rPr>
           <w:bCs/>
           <w:b/>
         </w:rPr>
-        <w:t xml:space="preserve">XSS</w:t>
-      </w:r>
-      <w:r>
-        <w:t xml:space="preserve">: textos do usuário são sempre escapados; a pré-visualização de DOM roda num iframe sem scripts.</w:t>
+        <w:t xml:space="preserve">modo estrito</w:t>
+      </w:r>
+      <w:r>
+        <w:t xml:space="preserve">, injeta</w:t>
+      </w:r>
+      <w:r>
+        <w:t xml:space="preserve"> </w:t>
+      </w:r>
+      <w:r>
+        <w:rPr>
+          <w:rStyle w:val="VerbatimChar"/>
+        </w:rPr>
+        <w:t xml:space="preserve">console</w:t>
+      </w:r>
+      <w:r>
+        <w:t xml:space="preserve">,</w:t>
+      </w:r>
+      <w:r>
+        <w:t xml:space="preserve"> </w:t>
+      </w:r>
+      <w:r>
+        <w:rPr>
+          <w:rStyle w:val="VerbatimChar"/>
+        </w:rPr>
+        <w:t xml:space="preserve">setTimeout</w:t>
+      </w:r>
+      <w:r>
+        <w:t xml:space="preserve">/</w:t>
+      </w:r>
+      <w:r>
+        <w:rPr>
+          <w:rStyle w:val="VerbatimChar"/>
+        </w:rPr>
+        <w:t xml:space="preserve">setInterval</w:t>
+      </w:r>
+      <w:r>
+        <w:t xml:space="preserve"> </w:t>
+      </w:r>
+      <w:r>
+        <w:t xml:space="preserve">rastreados e um</w:t>
+      </w:r>
+      <w:r>
+        <w:t xml:space="preserve"> </w:t>
+      </w:r>
+      <w:r>
+        <w:rPr>
+          <w:rStyle w:val="VerbatimChar"/>
+        </w:rPr>
+        <w:t xml:space="preserve">fetch</w:t>
+      </w:r>
+      <w:r>
+        <w:t xml:space="preserve"> </w:t>
+      </w:r>
+      <w:r>
+        <w:t xml:space="preserve">simulado (</w:t>
+      </w:r>
+      <w:r>
+        <w:rPr>
+          <w:rStyle w:val="VerbatimChar"/>
+        </w:rPr>
+        <w:t xml:space="preserve">https://api.exemplo.com/usuarios</w:t>
+      </w:r>
+      <w:r>
+        <w:t xml:space="preserve"> </w:t>
+      </w:r>
+      <w:r>
+        <w:t xml:space="preserve">e</w:t>
+      </w:r>
+      <w:r>
+        <w:t xml:space="preserve"> </w:t>
+      </w:r>
+      <w:r>
+        <w:rPr>
+          <w:rStyle w:val="VerbatimChar"/>
+        </w:rPr>
+        <w:t xml:space="preserve">/produtos</w:t>
+      </w:r>
+      <w:r>
+        <w:t xml:space="preserve">); nos exercícios de DOM injeta também</w:t>
+      </w:r>
+      <w:r>
+        <w:t xml:space="preserve"> </w:t>
+      </w:r>
+      <w:r>
+        <w:rPr>
+          <w:rStyle w:val="VerbatimChar"/>
+        </w:rPr>
+        <w:t xml:space="preserve">document</w:t>
+      </w:r>
+      <w:r>
+        <w:t xml:space="preserve"> </w:t>
+      </w:r>
+      <w:r>
+        <w:t xml:space="preserve">e</w:t>
+      </w:r>
+      <w:r>
+        <w:t xml:space="preserve"> </w:t>
+      </w:r>
+      <w:r>
+        <w:rPr>
+          <w:rStyle w:val="VerbatimChar"/>
+        </w:rPr>
+        <w:t xml:space="preserve">window</w:t>
+      </w:r>
+      <w:r>
+        <w:t xml:space="preserve"> </w:t>
+      </w:r>
+      <w:r>
+        <w:t xml:space="preserve">simulados.</w:t>
       </w:r>
     </w:p>
     <w:p>
@@ -2680,74 +2700,7 @@
         <w:pStyle w:val="Compact"/>
       </w:pPr>
       <w:r>
-        <w:rPr>
-          <w:bCs/>
-          <w:b/>
-        </w:rPr>
-        <w:t xml:space="preserve">Cabeçalhos HTTP</w:t>
-      </w:r>
-      <w:r>
-        <w:t xml:space="preserve"> </w:t>
-      </w:r>
-      <w:r>
-        <w:t xml:space="preserve">(</w:t>
-      </w:r>
-      <w:r>
-        <w:rPr>
-          <w:rStyle w:val="VerbatimChar"/>
-        </w:rPr>
-        <w:t xml:space="preserve">vercel.json</w:t>
-      </w:r>
-      <w:r>
-        <w:t xml:space="preserve">):</w:t>
-      </w:r>
-      <w:r>
-        <w:t xml:space="preserve"> </w:t>
-      </w:r>
-      <w:r>
-        <w:rPr>
-          <w:rStyle w:val="VerbatimChar"/>
-        </w:rPr>
-        <w:t xml:space="preserve">X-Content-Type-Options</w:t>
-      </w:r>
-      <w:r>
-        <w:t xml:space="preserve">,</w:t>
-      </w:r>
-      <w:r>
-        <w:t xml:space="preserve"> </w:t>
-      </w:r>
-      <w:r>
-        <w:rPr>
-          <w:rStyle w:val="VerbatimChar"/>
-        </w:rPr>
-        <w:t xml:space="preserve">Referrer-Policy</w:t>
-      </w:r>
-      <w:r>
-        <w:t xml:space="preserve">,</w:t>
-      </w:r>
-      <w:r>
-        <w:t xml:space="preserve"> </w:t>
-      </w:r>
-      <w:r>
-        <w:rPr>
-          <w:rStyle w:val="VerbatimChar"/>
-        </w:rPr>
-        <w:t xml:space="preserve">X-Frame-Options: DENY</w:t>
-      </w:r>
-      <w:r>
-        <w:t xml:space="preserve">,</w:t>
-      </w:r>
-      <w:r>
-        <w:t xml:space="preserve"> </w:t>
-      </w:r>
-      <w:r>
-        <w:rPr>
-          <w:rStyle w:val="VerbatimChar"/>
-        </w:rPr>
-        <w:t xml:space="preserve">Permissions-Policy</w:t>
-      </w:r>
-      <w:r>
-        <w:t xml:space="preserve">.</w:t>
+        <w:t xml:space="preserve">Os testes rodam no mesmo escopo do código e comparam o valor retornado com o esperado (comparação profunda), ou comparam a saída do console.</w:t>
       </w:r>
     </w:p>
     <w:p>
@@ -2759,101 +2712,130 @@
         <w:pStyle w:val="Compact"/>
       </w:pPr>
       <w:r>
-        <w:t xml:space="preserve">A configuração web do Firebase não é segredo; mesmo assim fica fora do Git (</w:t>
-      </w:r>
-      <w:r>
-        <w:rPr>
-          <w:rStyle w:val="VerbatimChar"/>
-        </w:rPr>
-        <w:t xml:space="preserve">.env</w:t>
-      </w:r>
-      <w:r>
-        <w:t xml:space="preserve">) e é cadastrada nas variáveis de ambiente da Vercel.</w:t>
+        <w:t xml:space="preserve">Limites: 6 s no total (loop infinito é interrompido), 2,5 s para o</w:t>
+      </w:r>
+      <w:r>
+        <w:t xml:space="preserve"> </w:t>
+      </w:r>
+      <w:r>
+        <w:rPr>
+          <w:rStyle w:val="VerbatimChar"/>
+        </w:rPr>
+        <w:t xml:space="preserve">await</w:t>
+      </w:r>
+      <w:r>
+        <w:t xml:space="preserve"> </w:t>
+      </w:r>
+      <w:r>
+        <w:t xml:space="preserve">principal, 1,5 s por teste assíncrono, 300 linhas de console.</w:t>
+      </w:r>
+    </w:p>
+    <w:bookmarkEnd w:id="35"/>
+    <w:bookmarkStart w:id="36" w:name="Xfaba23abf3c054b6d9d3988fdd6609edf0728be"/>
+    <w:p>
+      <w:pPr>
+        <w:pStyle w:val="Heading3"/>
+      </w:pPr>
+      <w:r>
+        <w:t xml:space="preserve">2.4 Modelo de dados (Firestore)</w:t>
+      </w:r>
+    </w:p>
+    <w:p>
+      <w:pPr>
+        <w:pStyle w:val="SourceCode"/>
+      </w:pPr>
+      <w:r>
+        <w:rPr>
+          <w:rStyle w:val="VerbatimChar"/>
+        </w:rPr>
+        <w:t xml:space="preserve">users/{uid}                     name, email, startDate, createdAt, updatedAt</w:t>
+      </w:r>
+      <w:r>
+        <w:br/>
+      </w:r>
+      <w:r>
+        <w:rPr>
+          <w:rStyle w:val="VerbatimChar"/>
+        </w:rPr>
+        <w:t xml:space="preserve">users/{uid}/progress/{exId}     attempts, passed, passedAt, failsBeforePass, hintsUsed,</w:t>
+      </w:r>
+      <w:r>
+        <w:br/>
+      </w:r>
+      <w:r>
+        <w:rPr>
+          <w:rStyle w:val="VerbatimChar"/>
+        </w:rPr>
+        <w:t xml:space="preserve">                                hintsBeforePass, solutionViewed, solutionBeforePass,</w:t>
+      </w:r>
+      <w:r>
+        <w:br/>
+      </w:r>
+      <w:r>
+        <w:rPr>
+          <w:rStyle w:val="VerbatimChar"/>
+        </w:rPr>
+        <w:t xml:space="preserve">                                reviewPasses, errors{tipo: n}, timeSec, lastCode, srs{interval, reps, due}</w:t>
+      </w:r>
+      <w:r>
+        <w:br/>
+      </w:r>
+      <w:r>
+        <w:rPr>
+          <w:rStyle w:val="VerbatimChar"/>
+        </w:rPr>
+        <w:t xml:space="preserve">users/{uid}/quiz/d{dia}         best, last, attempts, wrong[], at</w:t>
+      </w:r>
+      <w:r>
+        <w:br/>
+      </w:r>
+      <w:r>
+        <w:rPr>
+          <w:rStyle w:val="VerbatimChar"/>
+        </w:rPr>
+        <w:t xml:space="preserve">users/{uid}/notes/d{dia}        aprendi, duvidas, goals[], at</w:t>
+      </w:r>
+      <w:r>
+        <w:br/>
+      </w:r>
+      <w:r>
+        <w:rPr>
+          <w:rStyle w:val="VerbatimChar"/>
+        </w:rPr>
+        <w:t xml:space="preserve">users/{uid}/activity/{AAAA-MM-DD}  seconds, solved, attempts</w:t>
+      </w:r>
+    </w:p>
+    <w:p>
+      <w:pPr>
+        <w:pStyle w:val="FirstParagraph"/>
+      </w:pPr>
+      <w:r>
+        <w:t xml:space="preserve">Gravações são agrupadas (cerca de 1,2 s) e enviadas também ao esconder/fechar a aba. Sem Firebase configurado, tudo vai para o</w:t>
+      </w:r>
+      <w:r>
+        <w:t xml:space="preserve"> </w:t>
+      </w:r>
+      <w:r>
+        <w:rPr>
+          <w:rStyle w:val="VerbatimChar"/>
+        </w:rPr>
+        <w:t xml:space="preserve">localStorage</w:t>
+      </w:r>
+      <w:r>
+        <w:t xml:space="preserve"> </w:t>
+      </w:r>
+      <w:r>
+        <w:t xml:space="preserve">(“modo local”).</w:t>
       </w:r>
     </w:p>
     <w:bookmarkEnd w:id="36"/>
-    <w:bookmarkStart w:id="37" w:name="X89bed35c4118cbb1954f356229143ac61cec794"/>
+    <w:bookmarkStart w:id="37" w:name="X849eea489b120574476a6d9af7adedbaa368ddd"/>
     <w:p>
       <w:pPr>
         <w:pStyle w:val="Heading3"/>
       </w:pPr>
       <w:r>
-        <w:t xml:space="preserve">2.5.1 Administrador</w:t>
-      </w:r>
-    </w:p>
-    <w:p>
-      <w:pPr>
-        <w:pStyle w:val="FirstParagraph"/>
-      </w:pPr>
-      <w:r>
-        <w:t xml:space="preserve">O e-mail listado em</w:t>
-      </w:r>
-      <w:r>
-        <w:t xml:space="preserve"> </w:t>
-      </w:r>
-      <w:r>
-        <w:rPr>
-          <w:rStyle w:val="VerbatimChar"/>
-        </w:rPr>
-        <w:t xml:space="preserve">ADMIN_EMAILS</w:t>
-      </w:r>
-      <w:r>
-        <w:t xml:space="preserve"> </w:t>
-      </w:r>
-      <w:r>
-        <w:t xml:space="preserve">(</w:t>
-      </w:r>
-      <w:r>
-        <w:rPr>
-          <w:rStyle w:val="VerbatimChar"/>
-        </w:rPr>
-        <w:t xml:space="preserve">src/config.js</w:t>
-      </w:r>
-      <w:r>
-        <w:t xml:space="preserve">) e na função</w:t>
-      </w:r>
-      <w:r>
-        <w:t xml:space="preserve"> </w:t>
-      </w:r>
-      <w:r>
-        <w:rPr>
-          <w:rStyle w:val="VerbatimChar"/>
-        </w:rPr>
-        <w:t xml:space="preserve">isAdmin()</w:t>
-      </w:r>
-      <w:r>
-        <w:t xml:space="preserve"> </w:t>
-      </w:r>
-      <w:r>
-        <w:t xml:space="preserve">do</w:t>
-      </w:r>
-      <w:r>
-        <w:t xml:space="preserve"> </w:t>
-      </w:r>
-      <w:r>
-        <w:rPr>
-          <w:rStyle w:val="VerbatimChar"/>
-        </w:rPr>
-        <w:t xml:space="preserve">firestore.rules</w:t>
-      </w:r>
-      <w:r>
-        <w:t xml:space="preserve"> </w:t>
-      </w:r>
-      <w:r>
-        <w:t xml:space="preserve">vê o menu</w:t>
-      </w:r>
-      <w:r>
-        <w:t xml:space="preserve"> </w:t>
-      </w:r>
-      <w:r>
-        <w:rPr>
-          <w:bCs/>
-          <w:b/>
-        </w:rPr>
-        <w:t xml:space="preserve">🛡️ Admin</w:t>
-      </w:r>
-      <w:r>
-        <w:t xml:space="preserve">:</w:t>
+        <w:t xml:space="preserve">2.5 Segurança</w:t>
       </w:r>
     </w:p>
     <w:p>
@@ -2869,25 +2851,110 @@
           <w:bCs/>
           <w:b/>
         </w:rPr>
-        <w:t xml:space="preserve">Lista de alunos</w:t>
-      </w:r>
-      <w:r>
-        <w:t xml:space="preserve">: tarefas feitas / total, etapa, tempo de estudo, última atividade e dificuldades (lidas do campo</w:t>
-      </w:r>
-      <w:r>
-        <w:t xml:space="preserve"> </w:t>
-      </w:r>
-      <w:r>
-        <w:rPr>
-          <w:rStyle w:val="VerbatimChar"/>
-        </w:rPr>
-        <w:t xml:space="preserve">resumo</w:t>
-      </w:r>
-      <w:r>
-        <w:t xml:space="preserve"> </w:t>
-      </w:r>
-      <w:r>
-        <w:t xml:space="preserve">do perfil, atualizado pelo app do aluno).</w:t>
+        <w:t xml:space="preserve">Regras do Firestore</w:t>
+      </w:r>
+      <w:r>
+        <w:t xml:space="preserve"> </w:t>
+      </w:r>
+      <w:r>
+        <w:t xml:space="preserve">(</w:t>
+      </w:r>
+      <w:r>
+        <w:rPr>
+          <w:rStyle w:val="VerbatimChar"/>
+        </w:rPr>
+        <w:t xml:space="preserve">firestore.rules</w:t>
+      </w:r>
+      <w:r>
+        <w:t xml:space="preserve">): cada usuário só lê e grava</w:t>
+      </w:r>
+      <w:r>
+        <w:t xml:space="preserve"> </w:t>
+      </w:r>
+      <w:r>
+        <w:rPr>
+          <w:rStyle w:val="VerbatimChar"/>
+        </w:rPr>
+        <w:t xml:space="preserve">users/{seu uid}</w:t>
+      </w:r>
+      <w:r>
+        <w:t xml:space="preserve">; apenas as coleções</w:t>
+      </w:r>
+      <w:r>
+        <w:t xml:space="preserve"> </w:t>
+      </w:r>
+      <w:r>
+        <w:rPr>
+          <w:rStyle w:val="VerbatimChar"/>
+        </w:rPr>
+        <w:t xml:space="preserve">progress</w:t>
+      </w:r>
+      <w:r>
+        <w:t xml:space="preserve">,</w:t>
+      </w:r>
+      <w:r>
+        <w:t xml:space="preserve"> </w:t>
+      </w:r>
+      <w:r>
+        <w:rPr>
+          <w:rStyle w:val="VerbatimChar"/>
+        </w:rPr>
+        <w:t xml:space="preserve">quiz</w:t>
+      </w:r>
+      <w:r>
+        <w:t xml:space="preserve">,</w:t>
+      </w:r>
+      <w:r>
+        <w:t xml:space="preserve"> </w:t>
+      </w:r>
+      <w:r>
+        <w:rPr>
+          <w:rStyle w:val="VerbatimChar"/>
+        </w:rPr>
+        <w:t xml:space="preserve">notes</w:t>
+      </w:r>
+      <w:r>
+        <w:t xml:space="preserve"> </w:t>
+      </w:r>
+      <w:r>
+        <w:t xml:space="preserve">e</w:t>
+      </w:r>
+      <w:r>
+        <w:t xml:space="preserve"> </w:t>
+      </w:r>
+      <w:r>
+        <w:rPr>
+          <w:rStyle w:val="VerbatimChar"/>
+        </w:rPr>
+        <w:t xml:space="preserve">activity</w:t>
+      </w:r>
+      <w:r>
+        <w:t xml:space="preserve">; limites de tamanho (</w:t>
+      </w:r>
+      <w:r>
+        <w:rPr>
+          <w:rStyle w:val="VerbatimChar"/>
+        </w:rPr>
+        <w:t xml:space="preserve">lastCode</w:t>
+      </w:r>
+      <w:r>
+        <w:t xml:space="preserve"> </w:t>
+      </w:r>
+      <w:r>
+        <w:t xml:space="preserve">≤ 20 000 caracteres; diário ≤ 5 000). Todo o resto é negado. Testado: ler dados de outro usuário, listar usuários, gravar em coleção não permitida e acessar sem login retornam</w:t>
+      </w:r>
+      <w:r>
+        <w:t xml:space="preserve"> </w:t>
+      </w:r>
+      <w:r>
+        <w:rPr>
+          <w:bCs/>
+          <w:b/>
+        </w:rPr>
+        <w:t xml:space="preserve">403</w:t>
+      </w:r>
+      <w:r>
+        <w:t xml:space="preserve">.</w:t>
       </w:r>
     </w:p>
     <w:p>
@@ -2903,43 +2970,316 @@
           <w:bCs/>
           <w:b/>
         </w:rPr>
-        <w:t xml:space="preserve">Detalhe do aluno</w:t>
-      </w:r>
-      <w:r>
-        <w:t xml:space="preserve">: cada exercício (tentativas, dicas, solução vista, tempo, último código), notas dos quizzes, diário, erros mais comuns e tópicos com dificuldade.</w:t>
-      </w:r>
-    </w:p>
-    <w:p>
-      <w:pPr>
-        <w:pStyle w:val="FirstParagraph"/>
-      </w:pPr>
-      <w:r>
-        <w:t xml:space="preserve">O acesso é</w:t>
-      </w:r>
-      <w:r>
-        <w:t xml:space="preserve"> </w:t>
-      </w:r>
+        <w:t xml:space="preserve">Cadastro aberto</w:t>
+      </w:r>
+      <w:r>
+        <w:t xml:space="preserve">, com política de senha do Firebase e e-mail de confirmação. Recomendado:</w:t>
+      </w:r>
+      <w:r>
+        <w:t xml:space="preserve"> </w:t>
+      </w:r>
+      <w:r>
+        <w:rPr>
+          <w:iCs/>
+          <w:i/>
+        </w:rPr>
+        <w:t xml:space="preserve">Sign-up quota</w:t>
+      </w:r>
+      <w:r>
+        <w:t xml:space="preserve"> </w:t>
+      </w:r>
+      <w:r>
+        <w:t xml:space="preserve">por IP.</w:t>
+      </w:r>
+    </w:p>
+    <w:p>
+      <w:pPr>
+        <w:numPr>
+          <w:ilvl w:val="0"/>
+          <w:numId w:val="1008"/>
+        </w:numPr>
+        <w:pStyle w:val="Compact"/>
+      </w:pPr>
       <w:r>
         <w:rPr>
           <w:bCs/>
           <w:b/>
         </w:rPr>
-        <w:t xml:space="preserve">somente leitura</w:t>
-      </w:r>
-      <w:r>
-        <w:t xml:space="preserve"> </w:t>
-      </w:r>
-      <w:r>
-        <w:t xml:space="preserve">e exige</w:t>
-      </w:r>
-      <w:r>
-        <w:t xml:space="preserve"> </w:t>
-      </w:r>
+        <w:t xml:space="preserve">XSS</w:t>
+      </w:r>
+      <w:r>
+        <w:t xml:space="preserve">: textos do usuário são sempre escapados; a pré-visualização de DOM roda num iframe sem scripts.</w:t>
+      </w:r>
+    </w:p>
+    <w:p>
+      <w:pPr>
+        <w:numPr>
+          <w:ilvl w:val="0"/>
+          <w:numId w:val="1008"/>
+        </w:numPr>
+        <w:pStyle w:val="Compact"/>
+      </w:pPr>
       <w:r>
         <w:rPr>
           <w:bCs/>
           <w:b/>
         </w:rPr>
+        <w:t xml:space="preserve">Cabeçalhos HTTP</w:t>
+      </w:r>
+      <w:r>
+        <w:t xml:space="preserve"> </w:t>
+      </w:r>
+      <w:r>
+        <w:t xml:space="preserve">(</w:t>
+      </w:r>
+      <w:r>
+        <w:rPr>
+          <w:rStyle w:val="VerbatimChar"/>
+        </w:rPr>
+        <w:t xml:space="preserve">vercel.json</w:t>
+      </w:r>
+      <w:r>
+        <w:t xml:space="preserve">):</w:t>
+      </w:r>
+      <w:r>
+        <w:t xml:space="preserve"> </w:t>
+      </w:r>
+      <w:r>
+        <w:rPr>
+          <w:rStyle w:val="VerbatimChar"/>
+        </w:rPr>
+        <w:t xml:space="preserve">X-Content-Type-Options</w:t>
+      </w:r>
+      <w:r>
+        <w:t xml:space="preserve">,</w:t>
+      </w:r>
+      <w:r>
+        <w:t xml:space="preserve"> </w:t>
+      </w:r>
+      <w:r>
+        <w:rPr>
+          <w:rStyle w:val="VerbatimChar"/>
+        </w:rPr>
+        <w:t xml:space="preserve">Referrer-Policy</w:t>
+      </w:r>
+      <w:r>
+        <w:t xml:space="preserve">,</w:t>
+      </w:r>
+      <w:r>
+        <w:t xml:space="preserve"> </w:t>
+      </w:r>
+      <w:r>
+        <w:rPr>
+          <w:rStyle w:val="VerbatimChar"/>
+        </w:rPr>
+        <w:t xml:space="preserve">X-Frame-Options: DENY</w:t>
+      </w:r>
+      <w:r>
+        <w:t xml:space="preserve">,</w:t>
+      </w:r>
+      <w:r>
+        <w:t xml:space="preserve"> </w:t>
+      </w:r>
+      <w:r>
+        <w:rPr>
+          <w:rStyle w:val="VerbatimChar"/>
+        </w:rPr>
+        <w:t xml:space="preserve">Permissions-Policy</w:t>
+      </w:r>
+      <w:r>
+        <w:t xml:space="preserve">.</w:t>
+      </w:r>
+    </w:p>
+    <w:p>
+      <w:pPr>
+        <w:numPr>
+          <w:ilvl w:val="0"/>
+          <w:numId w:val="1008"/>
+        </w:numPr>
+        <w:pStyle w:val="Compact"/>
+      </w:pPr>
+      <w:r>
+        <w:t xml:space="preserve">A configuração web do Firebase não é segredo; mesmo assim fica fora do Git (</w:t>
+      </w:r>
+      <w:r>
+        <w:rPr>
+          <w:rStyle w:val="VerbatimChar"/>
+        </w:rPr>
+        <w:t xml:space="preserve">.env</w:t>
+      </w:r>
+      <w:r>
+        <w:t xml:space="preserve">) e é cadastrada nas variáveis de ambiente da Vercel.</w:t>
+      </w:r>
+    </w:p>
+    <w:bookmarkEnd w:id="37"/>
+    <w:bookmarkStart w:id="38" w:name="X89bed35c4118cbb1954f356229143ac61cec794"/>
+    <w:p>
+      <w:pPr>
+        <w:pStyle w:val="Heading3"/>
+      </w:pPr>
+      <w:r>
+        <w:t xml:space="preserve">2.5.1 Administrador</w:t>
+      </w:r>
+    </w:p>
+    <w:p>
+      <w:pPr>
+        <w:pStyle w:val="FirstParagraph"/>
+      </w:pPr>
+      <w:r>
+        <w:t xml:space="preserve">O e-mail listado em</w:t>
+      </w:r>
+      <w:r>
+        <w:t xml:space="preserve"> </w:t>
+      </w:r>
+      <w:r>
+        <w:rPr>
+          <w:rStyle w:val="VerbatimChar"/>
+        </w:rPr>
+        <w:t xml:space="preserve">ADMIN_EMAILS</w:t>
+      </w:r>
+      <w:r>
+        <w:t xml:space="preserve"> </w:t>
+      </w:r>
+      <w:r>
+        <w:t xml:space="preserve">(</w:t>
+      </w:r>
+      <w:r>
+        <w:rPr>
+          <w:rStyle w:val="VerbatimChar"/>
+        </w:rPr>
+        <w:t xml:space="preserve">src/config.js</w:t>
+      </w:r>
+      <w:r>
+        <w:t xml:space="preserve">) e na função</w:t>
+      </w:r>
+      <w:r>
+        <w:t xml:space="preserve"> </w:t>
+      </w:r>
+      <w:r>
+        <w:rPr>
+          <w:rStyle w:val="VerbatimChar"/>
+        </w:rPr>
+        <w:t xml:space="preserve">isAdmin()</w:t>
+      </w:r>
+      <w:r>
+        <w:t xml:space="preserve"> </w:t>
+      </w:r>
+      <w:r>
+        <w:t xml:space="preserve">do</w:t>
+      </w:r>
+      <w:r>
+        <w:t xml:space="preserve"> </w:t>
+      </w:r>
+      <w:r>
+        <w:rPr>
+          <w:rStyle w:val="VerbatimChar"/>
+        </w:rPr>
+        <w:t xml:space="preserve">firestore.rules</w:t>
+      </w:r>
+      <w:r>
+        <w:t xml:space="preserve"> </w:t>
+      </w:r>
+      <w:r>
+        <w:t xml:space="preserve">vê o menu</w:t>
+      </w:r>
+      <w:r>
+        <w:t xml:space="preserve"> </w:t>
+      </w:r>
+      <w:r>
+        <w:rPr>
+          <w:bCs/>
+          <w:b/>
+        </w:rPr>
+        <w:t xml:space="preserve">🛡️ Admin</w:t>
+      </w:r>
+      <w:r>
+        <w:t xml:space="preserve">:</w:t>
+      </w:r>
+    </w:p>
+    <w:p>
+      <w:pPr>
+        <w:numPr>
+          <w:ilvl w:val="0"/>
+          <w:numId w:val="1009"/>
+        </w:numPr>
+        <w:pStyle w:val="Compact"/>
+      </w:pPr>
+      <w:r>
+        <w:rPr>
+          <w:bCs/>
+          <w:b/>
+        </w:rPr>
+        <w:t xml:space="preserve">Lista de alunos</w:t>
+      </w:r>
+      <w:r>
+        <w:t xml:space="preserve">: tarefas feitas / total, etapa, tempo de estudo, última atividade e dificuldades (lidas do campo</w:t>
+      </w:r>
+      <w:r>
+        <w:t xml:space="preserve"> </w:t>
+      </w:r>
+      <w:r>
+        <w:rPr>
+          <w:rStyle w:val="VerbatimChar"/>
+        </w:rPr>
+        <w:t xml:space="preserve">resumo</w:t>
+      </w:r>
+      <w:r>
+        <w:t xml:space="preserve"> </w:t>
+      </w:r>
+      <w:r>
+        <w:t xml:space="preserve">do perfil, atualizado pelo app do aluno).</w:t>
+      </w:r>
+    </w:p>
+    <w:p>
+      <w:pPr>
+        <w:numPr>
+          <w:ilvl w:val="0"/>
+          <w:numId w:val="1009"/>
+        </w:numPr>
+        <w:pStyle w:val="Compact"/>
+      </w:pPr>
+      <w:r>
+        <w:rPr>
+          <w:bCs/>
+          <w:b/>
+        </w:rPr>
+        <w:t xml:space="preserve">Detalhe do aluno</w:t>
+      </w:r>
+      <w:r>
+        <w:t xml:space="preserve">: cada exercício (tentativas, dicas, solução vista, tempo, último código), notas dos quizzes, diário, erros mais comuns e tópicos com dificuldade.</w:t>
+      </w:r>
+    </w:p>
+    <w:p>
+      <w:pPr>
+        <w:pStyle w:val="FirstParagraph"/>
+      </w:pPr>
+      <w:r>
+        <w:t xml:space="preserve">O acesso é</w:t>
+      </w:r>
+      <w:r>
+        <w:t xml:space="preserve"> </w:t>
+      </w:r>
+      <w:r>
+        <w:rPr>
+          <w:bCs/>
+          <w:b/>
+        </w:rPr>
+        <w:t xml:space="preserve">somente leitura</w:t>
+      </w:r>
+      <w:r>
+        <w:t xml:space="preserve"> </w:t>
+      </w:r>
+      <w:r>
+        <w:t xml:space="preserve">e exige</w:t>
+      </w:r>
+      <w:r>
+        <w:t xml:space="preserve"> </w:t>
+      </w:r>
+      <w:r>
+        <w:rPr>
+          <w:bCs/>
+          <w:b/>
+        </w:rPr>
         <w:t xml:space="preserve">e-mail confirmado</w:t>
       </w:r>
       <w:r>
@@ -2949,8 +3289,8 @@
         <w:t xml:space="preserve">(a tela oferece reenviar a confirmação). Para trocar ou adicionar administradores, altere as duas listas e publique as regras.</w:t>
       </w:r>
     </w:p>
-    <w:bookmarkEnd w:id="37"/>
-    <w:bookmarkStart w:id="38" w:name="Xc97d66532232175837c1025324c5d1336b4623f"/>
+    <w:bookmarkEnd w:id="38"/>
+    <w:bookmarkStart w:id="39" w:name="Xc97d66532232175837c1025324c5d1336b4623f"/>
     <w:p>
       <w:pPr>
         <w:pStyle w:val="Heading3"/>
@@ -3297,8 +3637,8 @@
         </w:tc>
       </w:tr>
     </w:tbl>
-    <w:bookmarkEnd w:id="38"/>
-    <w:bookmarkStart w:id="39" w:name="Xdd4c8a1345fd2a09b605956d9c108963a2a94c7"/>
+    <w:bookmarkEnd w:id="39"/>
+    <w:bookmarkStart w:id="40" w:name="Xdd4c8a1345fd2a09b605956d9c108963a2a94c7"/>
     <w:p>
       <w:pPr>
         <w:pStyle w:val="Heading3"/>
@@ -3970,8 +4310,8 @@
         <w:t xml:space="preserve"> }]</w:t>
       </w:r>
     </w:p>
-    <w:bookmarkEnd w:id="39"/>
-    <w:bookmarkStart w:id="40" w:name="X046d779b98efa05c2ef9f7e66a32c7d1ef738d4"/>
+    <w:bookmarkEnd w:id="40"/>
+    <w:bookmarkStart w:id="41" w:name="X046d779b98efa05c2ef9f7e66a32c7d1ef738d4"/>
     <w:p>
       <w:pPr>
         <w:pStyle w:val="Heading3"/>
@@ -3984,7 +4324,7 @@
       <w:pPr>
         <w:numPr>
           <w:ilvl w:val="0"/>
-          <w:numId w:val="1009"/>
+          <w:numId w:val="1010"/>
         </w:numPr>
         <w:pStyle w:val="Compact"/>
       </w:pPr>
@@ -3996,7 +4336,7 @@
       <w:pPr>
         <w:numPr>
           <w:ilvl w:val="0"/>
-          <w:numId w:val="1009"/>
+          <w:numId w:val="1010"/>
         </w:numPr>
         <w:pStyle w:val="Compact"/>
       </w:pPr>
@@ -4008,7 +4348,7 @@
       <w:pPr>
         <w:numPr>
           <w:ilvl w:val="0"/>
-          <w:numId w:val="1009"/>
+          <w:numId w:val="1010"/>
         </w:numPr>
         <w:pStyle w:val="Compact"/>
       </w:pPr>
@@ -4016,9 +4356,9 @@
         <w:t xml:space="preserve">Plano gratuito do Firestore: 50 mil leituras e 20 mil gravações por dia (suficiente para dezenas de alunos ativos).</w:t>
       </w:r>
     </w:p>
-    <w:bookmarkEnd w:id="40"/>
     <w:bookmarkEnd w:id="41"/>
     <w:bookmarkEnd w:id="42"/>
+    <w:bookmarkEnd w:id="43"/>
     <w:sectPr/>
   </w:body>
 </w:document>
@@ -4356,34 +4696,7 @@
     <w:abstractNumId w:val="991"/>
   </w:num>
   <w:num w:numId="1005">
-    <w:abstractNumId w:val="99411"/>
-    <w:lvlOverride w:ilvl="0">
-      <w:startOverride w:val="1"/>
-    </w:lvlOverride>
-    <w:lvlOverride w:ilvl="1">
-      <w:startOverride w:val="1"/>
-    </w:lvlOverride>
-    <w:lvlOverride w:ilvl="2">
-      <w:startOverride w:val="1"/>
-    </w:lvlOverride>
-    <w:lvlOverride w:ilvl="3">
-      <w:startOverride w:val="1"/>
-    </w:lvlOverride>
-    <w:lvlOverride w:ilvl="4">
-      <w:startOverride w:val="1"/>
-    </w:lvlOverride>
-    <w:lvlOverride w:ilvl="5">
-      <w:startOverride w:val="1"/>
-    </w:lvlOverride>
-    <w:lvlOverride w:ilvl="6">
-      <w:startOverride w:val="1"/>
-    </w:lvlOverride>
-    <w:lvlOverride w:ilvl="7">
-      <w:startOverride w:val="1"/>
-    </w:lvlOverride>
-    <w:lvlOverride w:ilvl="8">
-      <w:startOverride w:val="1"/>
-    </w:lvlOverride>
+    <w:abstractNumId w:val="991"/>
   </w:num>
   <w:num w:numId="1006">
     <w:abstractNumId w:val="99411"/>
@@ -4416,12 +4729,42 @@
     </w:lvlOverride>
   </w:num>
   <w:num w:numId="1007">
-    <w:abstractNumId w:val="991"/>
+    <w:abstractNumId w:val="99411"/>
+    <w:lvlOverride w:ilvl="0">
+      <w:startOverride w:val="1"/>
+    </w:lvlOverride>
+    <w:lvlOverride w:ilvl="1">
+      <w:startOverride w:val="1"/>
+    </w:lvlOverride>
+    <w:lvlOverride w:ilvl="2">
+      <w:startOverride w:val="1"/>
+    </w:lvlOverride>
+    <w:lvlOverride w:ilvl="3">
+      <w:startOverride w:val="1"/>
+    </w:lvlOverride>
+    <w:lvlOverride w:ilvl="4">
+      <w:startOverride w:val="1"/>
+    </w:lvlOverride>
+    <w:lvlOverride w:ilvl="5">
+      <w:startOverride w:val="1"/>
+    </w:lvlOverride>
+    <w:lvlOverride w:ilvl="6">
+      <w:startOverride w:val="1"/>
+    </w:lvlOverride>
+    <w:lvlOverride w:ilvl="7">
+      <w:startOverride w:val="1"/>
+    </w:lvlOverride>
+    <w:lvlOverride w:ilvl="8">
+      <w:startOverride w:val="1"/>
+    </w:lvlOverride>
   </w:num>
   <w:num w:numId="1008">
     <w:abstractNumId w:val="991"/>
   </w:num>
   <w:num w:numId="1009">
+    <w:abstractNumId w:val="991"/>
+  </w:num>
+  <w:num w:numId="1010">
     <w:abstractNumId w:val="991"/>
   </w:num>
 </w:numbering>

</xml_diff>